<commit_message>
GPL3 notice to header files
</commit_message>
<xml_diff>
--- a/Documentation/JakelynnOS Kernel doco.docx
+++ b/Documentation/JakelynnOS Kernel doco.docx
@@ -2296,7 +2296,7 @@
         <w:pStyle w:val="Heading1"/>
         <w:numPr>
           <w:ilvl w:val="0"/>
-          <w:numId w:val="1"/>
+          <w:numId w:val="2"/>
         </w:numPr>
         <w:bidi w:val="0"/>
         <w:spacing w:before="0" w:after="120"/>
@@ -2328,7 +2328,7 @@
         <w:pStyle w:val="Heading2"/>
         <w:numPr>
           <w:ilvl w:val="1"/>
-          <w:numId w:val="1"/>
+          <w:numId w:val="2"/>
         </w:numPr>
         <w:bidi w:val="0"/>
         <w:ind w:hanging="0" w:start="0"/>
@@ -2524,143 +2524,40 @@
     </w:p>
     <w:p>
       <w:pPr>
-        <w:pStyle w:val="BodyText"/>
-        <w:bidi w:val="0"/>
-        <w:jc w:val="start"/>
-        <w:rPr/>
-      </w:pPr>
-      <w:r>
-        <w:rPr/>
-      </w:r>
-    </w:p>
-    <w:p>
-      <w:pPr>
-        <w:pStyle w:val="BodyText"/>
-        <w:bidi w:val="0"/>
-        <w:jc w:val="start"/>
-        <w:rPr/>
-      </w:pPr>
-      <w:r>
-        <w:rPr/>
-      </w:r>
-    </w:p>
-    <w:p>
-      <w:pPr>
-        <w:pStyle w:val="BodyText"/>
-        <w:bidi w:val="0"/>
-        <w:jc w:val="start"/>
-        <w:rPr/>
-      </w:pPr>
-      <w:r>
-        <w:rPr/>
-      </w:r>
-    </w:p>
-    <w:p>
-      <w:pPr>
-        <w:pStyle w:val="BodyText"/>
-        <w:bidi w:val="0"/>
-        <w:jc w:val="start"/>
-        <w:rPr/>
-      </w:pPr>
-      <w:r>
-        <w:rPr/>
-      </w:r>
-    </w:p>
-    <w:p>
-      <w:pPr>
         <w:pStyle w:val="Heading2"/>
         <w:numPr>
           <w:ilvl w:val="1"/>
-          <w:numId w:val="1"/>
+          <w:numId w:val="2"/>
         </w:numPr>
         <w:bidi w:val="0"/>
         <w:ind w:hanging="0" w:start="0"/>
         <w:jc w:val="start"/>
         <w:rPr/>
       </w:pPr>
-      <w:bookmarkStart w:id="2" w:name="__RefHeading___Toc362_3285181658"/>
+      <w:bookmarkStart w:id="2" w:name="__RefHeading___Toc366_3285181658"/>
       <w:bookmarkEnd w:id="2"/>
       <w:r>
         <w:rPr/>
-        <w:t>Create the make files</w:t>
-      </w:r>
-    </w:p>
-    <w:p>
-      <w:pPr>
-        <w:pStyle w:val="Heading3"/>
+        <w:t>Get it working</w:t>
+      </w:r>
+    </w:p>
+    <w:p>
+      <w:pPr>
+        <w:pStyle w:val="Heading2"/>
         <w:numPr>
-          <w:ilvl w:val="2"/>
-          <w:numId w:val="1"/>
+          <w:ilvl w:val="1"/>
+          <w:numId w:val="2"/>
         </w:numPr>
         <w:bidi w:val="0"/>
         <w:ind w:hanging="0" w:start="0"/>
         <w:jc w:val="start"/>
         <w:rPr/>
       </w:pPr>
-      <w:bookmarkStart w:id="3" w:name="__RefHeading___Toc364_3285181658"/>
+      <w:bookmarkStart w:id="3" w:name="__RefHeading___Toc368_3285181658"/>
       <w:bookmarkEnd w:id="3"/>
       <w:r>
         <w:rPr/>
-        <w:t xml:space="preserve">Makefiles </w:t>
-      </w:r>
-    </w:p>
-    <w:p>
-      <w:pPr>
-        <w:pStyle w:val="BodyText"/>
-        <w:bidi w:val="0"/>
-        <w:jc w:val="start"/>
-        <w:rPr/>
-      </w:pPr>
-      <w:r>
-        <w:rPr/>
-        <w:t>(sysroot/kernel/kernel): Makefile</w:t>
-      </w:r>
-    </w:p>
-    <w:p>
-      <w:pPr>
-        <w:pStyle w:val="BodyText"/>
-        <w:bidi w:val="0"/>
-        <w:jc w:val="start"/>
-        <w:rPr/>
-      </w:pPr>
-      <w:r>
-        <w:rPr/>
-        <w:t>(sysroot/kernel/libtty): Makefile</w:t>
-      </w:r>
-    </w:p>
-    <w:p>
-      <w:pPr>
-        <w:pStyle w:val="BodyText"/>
-        <w:bidi w:val="0"/>
-        <w:jc w:val="start"/>
-        <w:rPr/>
-      </w:pPr>
-      <w:r>
-        <w:rPr/>
-        <w:t>(sysroot/kernel/libkrnl): Makefile</w:t>
-      </w:r>
-    </w:p>
-    <w:p>
-      <w:pPr>
-        <w:pStyle w:val="BodyText"/>
-        <w:bidi w:val="0"/>
-        <w:jc w:val="start"/>
-        <w:rPr/>
-      </w:pPr>
-      <w:r>
-        <w:rPr/>
-        <w:t>(syroot/kernel/libstring): Makefile</w:t>
-      </w:r>
-    </w:p>
-    <w:p>
-      <w:pPr>
-        <w:pStyle w:val="BodyText"/>
-        <w:bidi w:val="0"/>
-        <w:jc w:val="start"/>
-        <w:rPr/>
-      </w:pPr>
-      <w:r>
-        <w:rPr/>
+        <w:t>Upload to git</w:t>
       </w:r>
     </w:p>
     <w:p>
@@ -2668,118 +2565,156 @@
         <w:pStyle w:val="Heading2"/>
         <w:numPr>
           <w:ilvl w:val="1"/>
-          <w:numId w:val="1"/>
+          <w:numId w:val="2"/>
         </w:numPr>
         <w:bidi w:val="0"/>
         <w:ind w:hanging="0" w:start="0"/>
         <w:jc w:val="start"/>
         <w:rPr/>
       </w:pPr>
-      <w:bookmarkStart w:id="4" w:name="__RefHeading___Toc366_3285181658"/>
+      <w:bookmarkStart w:id="4" w:name="__RefHeading___Toc370_3285181658"/>
       <w:bookmarkEnd w:id="4"/>
       <w:r>
         <w:rPr/>
-        <w:t>Get it working</w:t>
-      </w:r>
-    </w:p>
-    <w:p>
-      <w:pPr>
-        <w:pStyle w:val="Heading2"/>
+        <w:t>Next Steps</w:t>
+      </w:r>
+    </w:p>
+    <w:p>
+      <w:pPr>
+        <w:pStyle w:val="Heading3"/>
         <w:numPr>
-          <w:ilvl w:val="1"/>
-          <w:numId w:val="1"/>
+          <w:ilvl w:val="2"/>
+          <w:numId w:val="2"/>
         </w:numPr>
         <w:bidi w:val="0"/>
         <w:ind w:hanging="0" w:start="0"/>
         <w:jc w:val="start"/>
         <w:rPr/>
       </w:pPr>
-      <w:bookmarkStart w:id="5" w:name="__RefHeading___Toc368_3285181658"/>
+      <w:bookmarkStart w:id="5" w:name="__RefHeading___Toc374_3285181658"/>
       <w:bookmarkEnd w:id="5"/>
       <w:r>
         <w:rPr/>
-        <w:t>Upload to git</w:t>
-      </w:r>
-    </w:p>
-    <w:p>
-      <w:pPr>
-        <w:pStyle w:val="Heading2"/>
+        <w:t>Set up Global Descriptor Table (GDT)</w:t>
+      </w:r>
+    </w:p>
+    <w:p>
+      <w:pPr>
+        <w:pStyle w:val="BodyText"/>
+        <w:bidi w:val="0"/>
+        <w:jc w:val="start"/>
+        <w:rPr/>
+      </w:pPr>
+      <w:r>
+        <w:rPr/>
+        <w:t>Header: kernel/include/gdt.h</w:t>
+      </w:r>
+    </w:p>
+    <w:p>
+      <w:pPr>
+        <w:pStyle w:val="BodyText"/>
+        <w:bidi w:val="0"/>
+        <w:jc w:val="start"/>
+        <w:rPr/>
+      </w:pPr>
+      <w:r>
+        <w:rPr/>
+        <w:t>File: libkrnl/gdt.c</w:t>
+      </w:r>
+    </w:p>
+    <w:p>
+      <w:pPr>
+        <w:pStyle w:val="Heading4"/>
         <w:numPr>
-          <w:ilvl w:val="1"/>
-          <w:numId w:val="1"/>
+          <w:ilvl w:val="3"/>
+          <w:numId w:val="2"/>
         </w:numPr>
         <w:bidi w:val="0"/>
         <w:ind w:hanging="0" w:start="0"/>
         <w:jc w:val="start"/>
         <w:rPr/>
       </w:pPr>
-      <w:bookmarkStart w:id="6" w:name="__RefHeading___Toc370_3285181658"/>
+      <w:bookmarkStart w:id="6" w:name="__RefHeading___Toc88_163282470"/>
       <w:bookmarkEnd w:id="6"/>
       <w:r>
         <w:rPr/>
-        <w:t>Next Steps</w:t>
-      </w:r>
-    </w:p>
-    <w:p>
-      <w:pPr>
-        <w:pStyle w:val="Heading3"/>
+        <w:t>Data structures</w:t>
+      </w:r>
+    </w:p>
+    <w:p>
+      <w:pPr>
+        <w:pStyle w:val="Heading5"/>
         <w:numPr>
-          <w:ilvl w:val="2"/>
-          <w:numId w:val="1"/>
+          <w:ilvl w:val="4"/>
+          <w:numId w:val="2"/>
         </w:numPr>
         <w:bidi w:val="0"/>
         <w:ind w:hanging="0" w:start="0"/>
         <w:jc w:val="start"/>
         <w:rPr/>
       </w:pPr>
-      <w:bookmarkStart w:id="7" w:name="__RefHeading___Toc372_3285181658"/>
-      <w:bookmarkEnd w:id="7"/>
-      <w:r>
-        <w:rPr/>
-        <w:t>Check .sector permissions -- TODO</w:t>
-      </w:r>
-    </w:p>
-    <w:p>
-      <w:pPr>
-        <w:pStyle w:val="Heading3"/>
+      <w:r>
+        <w:rPr/>
+        <w:t>gdt_entry – a single entry in the GDT Table</w:t>
+      </w:r>
+    </w:p>
+    <w:p>
+      <w:pPr>
+        <w:pStyle w:val="Heading6"/>
         <w:numPr>
-          <w:ilvl w:val="2"/>
-          <w:numId w:val="1"/>
+          <w:ilvl w:val="5"/>
+          <w:numId w:val="2"/>
         </w:numPr>
         <w:bidi w:val="0"/>
         <w:ind w:hanging="0" w:start="0"/>
         <w:jc w:val="start"/>
         <w:rPr/>
       </w:pPr>
-      <w:bookmarkStart w:id="8" w:name="__RefHeading___Toc374_3285181658"/>
-      <w:bookmarkEnd w:id="8"/>
-      <w:r>
-        <w:rPr/>
-        <w:t>Set up Global Descriptor Table (GDT)</w:t>
+      <w:r>
+        <w:rPr/>
+        <w:t>Members:</w:t>
       </w:r>
     </w:p>
     <w:p>
       <w:pPr>
         <w:pStyle w:val="BodyText"/>
         <w:bidi w:val="0"/>
+        <w:ind w:start="709" w:end="0"/>
         <w:jc w:val="start"/>
         <w:rPr/>
       </w:pPr>
       <w:r>
         <w:rPr/>
-        <w:t>Header: kernel/include/gdt.h</w:t>
+        <w:t xml:space="preserve">uint32_t </w:t>
+        <w:tab/>
+        <w:t>limit – maximum addressale unit (maximum value 0xFFFFF)</w:t>
       </w:r>
     </w:p>
     <w:p>
       <w:pPr>
         <w:pStyle w:val="BodyText"/>
         <w:bidi w:val="0"/>
+        <w:ind w:start="709" w:end="0"/>
         <w:jc w:val="start"/>
         <w:rPr/>
       </w:pPr>
       <w:r>
         <w:rPr/>
-        <w:t>File: libkrnl/gdt.c</w:t>
+        <w:t>uint32_t</w:t>
+        <w:tab/>
+        <w:t>base_middle – Where the segment begins</w:t>
+      </w:r>
+    </w:p>
+    <w:p>
+      <w:pPr>
+        <w:pStyle w:val="BodyText"/>
+        <w:bidi w:val="0"/>
+        <w:ind w:start="709" w:end="0"/>
+        <w:jc w:val="start"/>
+        <w:rPr/>
+      </w:pPr>
+      <w:r>
+        <w:rPr/>
       </w:r>
     </w:p>
     <w:p>
@@ -2787,18 +2722,18 @@
         <w:pStyle w:val="Heading4"/>
         <w:numPr>
           <w:ilvl w:val="3"/>
-          <w:numId w:val="1"/>
+          <w:numId w:val="2"/>
         </w:numPr>
         <w:bidi w:val="0"/>
         <w:ind w:hanging="0" w:start="0"/>
         <w:jc w:val="start"/>
         <w:rPr/>
       </w:pPr>
-      <w:bookmarkStart w:id="9" w:name="__RefHeading___Toc88_163282470"/>
-      <w:bookmarkEnd w:id="9"/>
-      <w:r>
-        <w:rPr/>
-        <w:t>Data structures</w:t>
+      <w:bookmarkStart w:id="7" w:name="__RefHeading___Toc90_163282470"/>
+      <w:bookmarkEnd w:id="7"/>
+      <w:r>
+        <w:rPr/>
+        <w:t>Functions</w:t>
       </w:r>
     </w:p>
     <w:p>
@@ -2806,7 +2741,7 @@
         <w:pStyle w:val="Heading5"/>
         <w:numPr>
           <w:ilvl w:val="4"/>
-          <w:numId w:val="1"/>
+          <w:numId w:val="2"/>
         </w:numPr>
         <w:bidi w:val="0"/>
         <w:ind w:hanging="0" w:start="0"/>
@@ -2815,7 +2750,7 @@
       </w:pPr>
       <w:r>
         <w:rPr/>
-        <w:t>gdt_entry – a single entry in the GDT Table</w:t>
+        <w:t>setGDTEntry: Set an entry going in the GDT table</w:t>
       </w:r>
     </w:p>
     <w:p>
@@ -2823,7 +2758,7 @@
         <w:pStyle w:val="Heading6"/>
         <w:numPr>
           <w:ilvl w:val="5"/>
-          <w:numId w:val="1"/>
+          <w:numId w:val="2"/>
         </w:numPr>
         <w:bidi w:val="0"/>
         <w:ind w:hanging="0" w:start="0"/>
@@ -2832,7 +2767,26 @@
       </w:pPr>
       <w:r>
         <w:rPr/>
-        <w:t>Members:</w:t>
+        <w:t xml:space="preserve">Returns: </w:t>
+        <w:tab/>
+        <w:t>bool – true if entry is complete, false if .limit is too big (&gt;0xFFFFF)</w:t>
+      </w:r>
+    </w:p>
+    <w:p>
+      <w:pPr>
+        <w:pStyle w:val="Heading6"/>
+        <w:numPr>
+          <w:ilvl w:val="5"/>
+          <w:numId w:val="2"/>
+        </w:numPr>
+        <w:bidi w:val="0"/>
+        <w:ind w:hanging="0" w:start="0"/>
+        <w:jc w:val="start"/>
+        <w:rPr/>
+      </w:pPr>
+      <w:r>
+        <w:rPr/>
+        <w:t>Parameters:</w:t>
       </w:r>
     </w:p>
     <w:p>
@@ -2845,9 +2799,9 @@
       </w:pPr>
       <w:r>
         <w:rPr/>
-        <w:t xml:space="preserve">uint32_t </w:t>
+        <w:t xml:space="preserve">gdt_entry* </w:t>
         <w:tab/>
-        <w:t>limit – maximum addressale unit (maximum value 0xFFFFF)</w:t>
+        <w:t>target – entry created (if return is false, undefined)</w:t>
       </w:r>
     </w:p>
     <w:p>
@@ -2860,154 +2814,40 @@
       </w:pPr>
       <w:r>
         <w:rPr/>
-        <w:t>uint32_t</w:t>
+        <w:t xml:space="preserve">gdtentry </w:t>
         <w:tab/>
-        <w:t>base_middle – Where the segment begins</w:t>
-      </w:r>
-    </w:p>
-    <w:p>
-      <w:pPr>
-        <w:pStyle w:val="BodyText"/>
-        <w:bidi w:val="0"/>
-        <w:ind w:start="709" w:end="0"/>
-        <w:jc w:val="start"/>
-        <w:rPr/>
-      </w:pPr>
-      <w:r>
-        <w:rPr/>
-      </w:r>
-    </w:p>
-    <w:p>
-      <w:pPr>
-        <w:pStyle w:val="Heading4"/>
+        <w:t>source – what to fill in target with</w:t>
+      </w:r>
+    </w:p>
+    <w:p>
+      <w:pPr>
+        <w:pStyle w:val="Heading3"/>
         <w:numPr>
-          <w:ilvl w:val="3"/>
-          <w:numId w:val="1"/>
+          <w:ilvl w:val="2"/>
+          <w:numId w:val="2"/>
         </w:numPr>
         <w:bidi w:val="0"/>
         <w:ind w:hanging="0" w:start="0"/>
         <w:jc w:val="start"/>
         <w:rPr/>
       </w:pPr>
-      <w:bookmarkStart w:id="10" w:name="__RefHeading___Toc90_163282470"/>
-      <w:bookmarkEnd w:id="10"/>
-      <w:r>
-        <w:rPr/>
-        <w:t>Functions</w:t>
-      </w:r>
-    </w:p>
-    <w:p>
-      <w:pPr>
-        <w:pStyle w:val="Heading5"/>
-        <w:numPr>
-          <w:ilvl w:val="4"/>
-          <w:numId w:val="1"/>
-        </w:numPr>
-        <w:bidi w:val="0"/>
-        <w:ind w:hanging="0" w:start="0"/>
-        <w:jc w:val="start"/>
-        <w:rPr/>
-      </w:pPr>
-      <w:r>
-        <w:rPr/>
-        <w:t>setGDTEntry: Set an entry going in the GDT table</w:t>
-      </w:r>
-    </w:p>
-    <w:p>
-      <w:pPr>
-        <w:pStyle w:val="Heading6"/>
-        <w:numPr>
-          <w:ilvl w:val="5"/>
-          <w:numId w:val="1"/>
-        </w:numPr>
-        <w:bidi w:val="0"/>
-        <w:ind w:hanging="0" w:start="0"/>
-        <w:jc w:val="start"/>
-        <w:rPr/>
-      </w:pPr>
-      <w:r>
-        <w:rPr/>
-        <w:t xml:space="preserve">Returns: </w:t>
-        <w:tab/>
-        <w:t>bool – true if entry is complete, false if .limit is too big (&gt;0xFFFFF)</w:t>
-      </w:r>
-    </w:p>
-    <w:p>
-      <w:pPr>
-        <w:pStyle w:val="Heading6"/>
-        <w:numPr>
-          <w:ilvl w:val="5"/>
-          <w:numId w:val="1"/>
-        </w:numPr>
-        <w:bidi w:val="0"/>
-        <w:ind w:hanging="0" w:start="0"/>
-        <w:jc w:val="start"/>
-        <w:rPr/>
-      </w:pPr>
-      <w:r>
-        <w:rPr/>
-        <w:t>Parameters:</w:t>
-      </w:r>
-    </w:p>
-    <w:p>
-      <w:pPr>
-        <w:pStyle w:val="BodyText"/>
-        <w:bidi w:val="0"/>
-        <w:ind w:start="709" w:end="0"/>
-        <w:jc w:val="start"/>
-        <w:rPr/>
-      </w:pPr>
-      <w:r>
-        <w:rPr/>
-        <w:t xml:space="preserve">gdt_entry* </w:t>
-        <w:tab/>
-        <w:t>target – entry created (if return is false, undefined)</w:t>
-      </w:r>
-    </w:p>
-    <w:p>
-      <w:pPr>
-        <w:pStyle w:val="BodyText"/>
-        <w:bidi w:val="0"/>
-        <w:ind w:start="709" w:end="0"/>
-        <w:jc w:val="start"/>
-        <w:rPr/>
-      </w:pPr>
-      <w:r>
-        <w:rPr/>
-        <w:t xml:space="preserve">gdtentry </w:t>
-        <w:tab/>
-        <w:t>source – what to fill in target with</w:t>
-      </w:r>
-    </w:p>
-    <w:p>
-      <w:pPr>
-        <w:pStyle w:val="Heading3"/>
-        <w:numPr>
-          <w:ilvl w:val="2"/>
-          <w:numId w:val="1"/>
-        </w:numPr>
-        <w:bidi w:val="0"/>
-        <w:ind w:hanging="0" w:start="0"/>
-        <w:jc w:val="start"/>
-        <w:rPr/>
-      </w:pPr>
-      <w:r>
-        <w:rPr/>
-      </w:r>
-      <w:bookmarkStart w:id="11" w:name="__RefHeading___Toc376_3285181658"/>
-      <w:bookmarkEnd w:id="11"/>
+      <w:r>
+        <w:rPr/>
+      </w:r>
+      <w:bookmarkStart w:id="8" w:name="__RefHeading___Toc376_3285181658"/>
+      <w:bookmarkEnd w:id="8"/>
     </w:p>
     <w:p>
       <w:pPr>
         <w:pStyle w:val="Heading1"/>
         <w:numPr>
           <w:ilvl w:val="0"/>
-          <w:numId w:val="1"/>
+          <w:numId w:val="2"/>
         </w:numPr>
         <w:rPr/>
       </w:pPr>
-      <w:bookmarkStart w:id="12" w:name="__RefHeading___Toc378_3285181658"/>
-      <w:bookmarkEnd w:id="12"/>
+      <w:bookmarkStart w:id="9" w:name="__RefHeading___Toc378_3285181658"/>
+      <w:bookmarkEnd w:id="9"/>
       <w:r>
         <w:rPr/>
         <w:t>Narratives</w:t>
@@ -3018,13 +2858,13 @@
         <w:pStyle w:val="Heading2"/>
         <w:numPr>
           <w:ilvl w:val="1"/>
-          <w:numId w:val="1"/>
+          <w:numId w:val="2"/>
         </w:numPr>
         <w:ind w:hanging="0" w:start="0"/>
         <w:rPr/>
       </w:pPr>
-      <w:bookmarkStart w:id="13" w:name="__RefHeading___Toc3241_3905749740"/>
-      <w:bookmarkEnd w:id="13"/>
+      <w:bookmarkStart w:id="10" w:name="__RefHeading___Toc3241_3905749740"/>
+      <w:bookmarkEnd w:id="10"/>
       <w:r>
         <w:rPr/>
         <w:t>Physical Memory Manager</w:t>
@@ -3050,44 +2890,6 @@
       <w:r>
         <w:rPr/>
         <w:t>Static properties it tracks</w:t>
-      </w:r>
-    </w:p>
-    <w:p>
-      <w:pPr>
-        <w:pStyle w:val="BodyText"/>
-        <w:numPr>
-          <w:ilvl w:val="0"/>
-          <w:numId w:val="3"/>
-        </w:numPr>
-        <w:rPr/>
-      </w:pPr>
-      <w:r>
-        <w:rPr/>
-        <w:t>Does physical memory exist</w:t>
-      </w:r>
-    </w:p>
-    <w:p>
-      <w:pPr>
-        <w:pStyle w:val="BodyText"/>
-        <w:numPr>
-          <w:ilvl w:val="0"/>
-          <w:numId w:val="3"/>
-        </w:numPr>
-        <w:rPr/>
-      </w:pPr>
-      <w:r>
-        <w:rPr/>
-        <w:t>Is the physical memory available, if it is not available it is reserved by default.</w:t>
-      </w:r>
-    </w:p>
-    <w:p>
-      <w:pPr>
-        <w:pStyle w:val="BodyText"/>
-        <w:rPr/>
-      </w:pPr>
-      <w:r>
-        <w:rPr/>
-        <w:t>Dynamic properties</w:t>
       </w:r>
     </w:p>
     <w:p>
@@ -3101,17 +2903,21 @@
       </w:pPr>
       <w:r>
         <w:rPr/>
-        <w:t>Is the physical memory in use by virtual memory</w:t>
+        <w:t>Does physical memory exist</w:t>
       </w:r>
     </w:p>
     <w:p>
       <w:pPr>
         <w:pStyle w:val="BodyText"/>
-        <w:rPr/>
-      </w:pPr>
-      <w:r>
-        <w:rPr/>
-        <w:t>Functions</w:t>
+        <w:numPr>
+          <w:ilvl w:val="0"/>
+          <w:numId w:val="4"/>
+        </w:numPr>
+        <w:rPr/>
+      </w:pPr>
+      <w:r>
+        <w:rPr/>
+        <w:t>Is the physical memory available, if it is not available it is reserved by default.</w:t>
       </w:r>
     </w:p>
     <w:p>
@@ -3121,17 +2927,7 @@
       </w:pPr>
       <w:r>
         <w:rPr/>
-        <w:t>An initPMM() function does the initial setup of memory, it reads the multiboot physical memory map, and sets initial ‘in use’ for things that have already been allocated before the physical memory manager is active.</w:t>
-      </w:r>
-    </w:p>
-    <w:p>
-      <w:pPr>
-        <w:pStyle w:val="BodyText"/>
-        <w:rPr/>
-      </w:pPr>
-      <w:r>
-        <w:rPr/>
-        <w:t>Property functions:</w:t>
+        <w:t>Dynamic properties</w:t>
       </w:r>
     </w:p>
     <w:p>
@@ -3145,59 +2941,37 @@
       </w:pPr>
       <w:r>
         <w:rPr/>
-        <w:t>does memory exist</w:t>
+        <w:t>Is the physical memory in use by virtual memory</w:t>
       </w:r>
     </w:p>
     <w:p>
       <w:pPr>
         <w:pStyle w:val="BodyText"/>
-        <w:numPr>
-          <w:ilvl w:val="0"/>
-          <w:numId w:val="5"/>
-        </w:numPr>
-        <w:rPr/>
-      </w:pPr>
-      <w:r>
-        <w:rPr/>
-        <w:t>is memory available</w:t>
+        <w:rPr/>
+      </w:pPr>
+      <w:r>
+        <w:rPr/>
+        <w:t>Functions</w:t>
       </w:r>
     </w:p>
     <w:p>
       <w:pPr>
         <w:pStyle w:val="BodyText"/>
-        <w:numPr>
-          <w:ilvl w:val="0"/>
-          <w:numId w:val="5"/>
-        </w:numPr>
-        <w:rPr/>
-      </w:pPr>
-      <w:r>
-        <w:rPr/>
-        <w:t>is memory reserved</w:t>
+        <w:rPr/>
+      </w:pPr>
+      <w:r>
+        <w:rPr/>
+        <w:t>An initPMM() function does the initial setup of memory, it reads the multiboot physical memory map, and sets initial ‘in use’ for things that have already been allocated before the physical memory manager is active.</w:t>
       </w:r>
     </w:p>
     <w:p>
       <w:pPr>
         <w:pStyle w:val="BodyText"/>
-        <w:numPr>
-          <w:ilvl w:val="0"/>
-          <w:numId w:val="5"/>
-        </w:numPr>
-        <w:rPr/>
-      </w:pPr>
-      <w:r>
-        <w:rPr/>
-        <w:t>Is memory in use</w:t>
-      </w:r>
-    </w:p>
-    <w:p>
-      <w:pPr>
-        <w:pStyle w:val="BodyText"/>
-        <w:rPr/>
-      </w:pPr>
-      <w:r>
-        <w:rPr/>
-        <w:t>In use functions:</w:t>
+        <w:rPr/>
+      </w:pPr>
+      <w:r>
+        <w:rPr/>
+        <w:t>Property functions:</w:t>
       </w:r>
     </w:p>
     <w:p>
@@ -3211,7 +2985,7 @@
       </w:pPr>
       <w:r>
         <w:rPr/>
-        <w:t>get the next unused physical memory page</w:t>
+        <w:t>does memory exist</w:t>
       </w:r>
     </w:p>
     <w:p>
@@ -3225,7 +2999,7 @@
       </w:pPr>
       <w:r>
         <w:rPr/>
-        <w:t>allocate memory for virtual memory to use, set in use flag</w:t>
+        <w:t>is memory available</w:t>
       </w:r>
     </w:p>
     <w:p>
@@ -3239,46 +3013,31 @@
       </w:pPr>
       <w:r>
         <w:rPr/>
-        <w:t>deallocate memory when virtual memory is done with it, clear in use flag</w:t>
-      </w:r>
-    </w:p>
-    <w:p>
-      <w:pPr>
-        <w:pStyle w:val="Heading2"/>
+        <w:t>is memory reserved</w:t>
+      </w:r>
+    </w:p>
+    <w:p>
+      <w:pPr>
+        <w:pStyle w:val="BodyText"/>
         <w:numPr>
-          <w:ilvl w:val="1"/>
-          <w:numId w:val="1"/>
+          <w:ilvl w:val="0"/>
+          <w:numId w:val="6"/>
         </w:numPr>
-        <w:ind w:hanging="0" w:start="0"/>
-        <w:rPr/>
-      </w:pPr>
-      <w:bookmarkStart w:id="14" w:name="__RefHeading___Toc3243_3905749740"/>
-      <w:bookmarkEnd w:id="14"/>
-      <w:r>
-        <w:rPr/>
-        <w:t>Virtual Memory Manager</w:t>
+        <w:rPr/>
+      </w:pPr>
+      <w:r>
+        <w:rPr/>
+        <w:t>Is memory in use</w:t>
       </w:r>
     </w:p>
     <w:p>
       <w:pPr>
         <w:pStyle w:val="BodyText"/>
-        <w:ind w:hanging="0" w:start="0"/>
-        <w:rPr/>
-      </w:pPr>
-      <w:r>
-        <w:rPr/>
-        <w:t>The Virtual Memory Manager keeps track of virtual memory.</w:t>
-      </w:r>
-    </w:p>
-    <w:p>
-      <w:pPr>
-        <w:pStyle w:val="BodyText"/>
-        <w:ind w:hanging="0" w:start="0"/>
-        <w:rPr/>
-      </w:pPr>
-      <w:r>
-        <w:rPr/>
-        <w:t>Static properties</w:t>
+        <w:rPr/>
+      </w:pPr>
+      <w:r>
+        <w:rPr/>
+        <w:t>In use functions:</w:t>
       </w:r>
     </w:p>
     <w:p>
@@ -3292,17 +3051,74 @@
       </w:pPr>
       <w:r>
         <w:rPr/>
-        <w:t>is it kernel memory</w:t>
+        <w:t>get the next unused physical memory page</w:t>
       </w:r>
     </w:p>
     <w:p>
       <w:pPr>
         <w:pStyle w:val="BodyText"/>
-        <w:rPr/>
-      </w:pPr>
-      <w:r>
-        <w:rPr/>
-        <w:t>Dynamic properties</w:t>
+        <w:numPr>
+          <w:ilvl w:val="0"/>
+          <w:numId w:val="7"/>
+        </w:numPr>
+        <w:rPr/>
+      </w:pPr>
+      <w:r>
+        <w:rPr/>
+        <w:t>allocate memory for virtual memory to use, set in use flag</w:t>
+      </w:r>
+    </w:p>
+    <w:p>
+      <w:pPr>
+        <w:pStyle w:val="BodyText"/>
+        <w:numPr>
+          <w:ilvl w:val="0"/>
+          <w:numId w:val="7"/>
+        </w:numPr>
+        <w:rPr/>
+      </w:pPr>
+      <w:r>
+        <w:rPr/>
+        <w:t>deallocate memory when virtual memory is done with it, clear in use flag</w:t>
+      </w:r>
+    </w:p>
+    <w:p>
+      <w:pPr>
+        <w:pStyle w:val="Heading2"/>
+        <w:numPr>
+          <w:ilvl w:val="1"/>
+          <w:numId w:val="2"/>
+        </w:numPr>
+        <w:ind w:hanging="0" w:start="0"/>
+        <w:rPr/>
+      </w:pPr>
+      <w:bookmarkStart w:id="11" w:name="__RefHeading___Toc3243_3905749740"/>
+      <w:bookmarkEnd w:id="11"/>
+      <w:r>
+        <w:rPr/>
+        <w:t>Virtual Memory Manager</w:t>
+      </w:r>
+    </w:p>
+    <w:p>
+      <w:pPr>
+        <w:pStyle w:val="BodyText"/>
+        <w:ind w:hanging="0" w:start="0"/>
+        <w:rPr/>
+      </w:pPr>
+      <w:r>
+        <w:rPr/>
+        <w:t>The Virtual Memory Manager keeps track of virtual memory.</w:t>
+      </w:r>
+    </w:p>
+    <w:p>
+      <w:pPr>
+        <w:pStyle w:val="BodyText"/>
+        <w:ind w:hanging="0" w:start="0"/>
+        <w:rPr/>
+      </w:pPr>
+      <w:r>
+        <w:rPr/>
+        <w:t>Static properties</w:t>
       </w:r>
     </w:p>
     <w:p>
@@ -3316,7 +3132,17 @@
       </w:pPr>
       <w:r>
         <w:rPr/>
-        <w:t>is memory read only</w:t>
+        <w:t>is it kernel memory</w:t>
+      </w:r>
+    </w:p>
+    <w:p>
+      <w:pPr>
+        <w:pStyle w:val="BodyText"/>
+        <w:rPr/>
+      </w:pPr>
+      <w:r>
+        <w:rPr/>
+        <w:t>Dynamic properties</w:t>
       </w:r>
     </w:p>
     <w:p>
@@ -3324,13 +3150,13 @@
         <w:pStyle w:val="BodyText"/>
         <w:numPr>
           <w:ilvl w:val="0"/>
-          <w:numId w:val="8"/>
+          <w:numId w:val="9"/>
         </w:numPr>
         <w:rPr/>
       </w:pPr>
       <w:r>
         <w:rPr/>
-        <w:t>is memory shared (physical memory is in more than 1 virtual memory location)</w:t>
+        <w:t>is memory read only</w:t>
       </w:r>
     </w:p>
     <w:p>
@@ -3338,23 +3164,13 @@
         <w:pStyle w:val="BodyText"/>
         <w:numPr>
           <w:ilvl w:val="0"/>
-          <w:numId w:val="8"/>
+          <w:numId w:val="9"/>
         </w:numPr>
         <w:rPr/>
       </w:pPr>
       <w:r>
         <w:rPr/>
-        <w:t>is memory in use</w:t>
-      </w:r>
-    </w:p>
-    <w:p>
-      <w:pPr>
-        <w:pStyle w:val="BodyText"/>
-        <w:rPr/>
-      </w:pPr>
-      <w:r>
-        <w:rPr/>
-        <w:t>Hosted dynamic properties</w:t>
+        <w:t>is memory shared (physical memory is in more than 1 virtual memory location)</w:t>
       </w:r>
     </w:p>
     <w:p>
@@ -3362,13 +3178,23 @@
         <w:pStyle w:val="BodyText"/>
         <w:numPr>
           <w:ilvl w:val="0"/>
-          <w:numId w:val="8"/>
+          <w:numId w:val="9"/>
         </w:numPr>
         <w:rPr/>
       </w:pPr>
       <w:r>
         <w:rPr/>
-        <w:t>is memory swappable, used by paging</w:t>
+        <w:t>is memory in use</w:t>
+      </w:r>
+    </w:p>
+    <w:p>
+      <w:pPr>
+        <w:pStyle w:val="BodyText"/>
+        <w:rPr/>
+      </w:pPr>
+      <w:r>
+        <w:rPr/>
+        <w:t>Hosted dynamic properties</w:t>
       </w:r>
     </w:p>
     <w:p>
@@ -3376,7 +3202,21 @@
         <w:pStyle w:val="BodyText"/>
         <w:numPr>
           <w:ilvl w:val="0"/>
-          <w:numId w:val="8"/>
+          <w:numId w:val="9"/>
+        </w:numPr>
+        <w:rPr/>
+      </w:pPr>
+      <w:r>
+        <w:rPr/>
+        <w:t>is memory swappable, used by paging</w:t>
+      </w:r>
+    </w:p>
+    <w:p>
+      <w:pPr>
+        <w:pStyle w:val="BodyText"/>
+        <w:numPr>
+          <w:ilvl w:val="0"/>
+          <w:numId w:val="9"/>
         </w:numPr>
         <w:rPr/>
       </w:pPr>
@@ -3475,13 +3315,13 @@
         <w:pStyle w:val="Heading2"/>
         <w:numPr>
           <w:ilvl w:val="1"/>
-          <w:numId w:val="1"/>
+          <w:numId w:val="2"/>
         </w:numPr>
         <w:ind w:hanging="0" w:start="0"/>
         <w:rPr/>
       </w:pPr>
-      <w:bookmarkStart w:id="15" w:name="__RefHeading___Toc3254_1306602172"/>
-      <w:bookmarkEnd w:id="15"/>
+      <w:bookmarkStart w:id="12" w:name="__RefHeading___Toc3254_1306602172"/>
+      <w:bookmarkEnd w:id="12"/>
       <w:r>
         <w:rPr/>
         <w:t>Video</w:t>
@@ -3526,13 +3366,13 @@
         <w:pStyle w:val="Heading2"/>
         <w:numPr>
           <w:ilvl w:val="1"/>
-          <w:numId w:val="1"/>
+          <w:numId w:val="2"/>
         </w:numPr>
         <w:ind w:hanging="0" w:start="0"/>
         <w:rPr/>
       </w:pPr>
-      <w:bookmarkStart w:id="16" w:name="__RefHeading___Toc3174_577436461"/>
-      <w:bookmarkEnd w:id="16"/>
+      <w:bookmarkStart w:id="13" w:name="__RefHeading___Toc3174_577436461"/>
+      <w:bookmarkEnd w:id="13"/>
       <w:r>
         <w:rPr/>
         <w:t>Kernel command line options</w:t>
@@ -3543,13 +3383,13 @@
         <w:pStyle w:val="Heading3"/>
         <w:numPr>
           <w:ilvl w:val="2"/>
-          <w:numId w:val="1"/>
+          <w:numId w:val="2"/>
         </w:numPr>
         <w:ind w:hanging="0" w:start="0"/>
         <w:rPr/>
       </w:pPr>
-      <w:bookmarkStart w:id="17" w:name="__RefHeading___Toc3176_577436461"/>
-      <w:bookmarkEnd w:id="17"/>
+      <w:bookmarkStart w:id="14" w:name="__RefHeading___Toc3176_577436461"/>
+      <w:bookmarkEnd w:id="14"/>
       <w:r>
         <w:rPr/>
         <w:t>-k – Kernel parameters</w:t>
@@ -3581,13 +3421,13 @@
         <w:pStyle w:val="Heading2"/>
         <w:numPr>
           <w:ilvl w:val="1"/>
-          <w:numId w:val="1"/>
+          <w:numId w:val="2"/>
         </w:numPr>
         <w:ind w:hanging="0" w:start="0"/>
         <w:rPr/>
       </w:pPr>
-      <w:bookmarkStart w:id="18" w:name="__RefHeading___Toc3256_1306602172"/>
-      <w:bookmarkEnd w:id="18"/>
+      <w:bookmarkStart w:id="15" w:name="__RefHeading___Toc3256_1306602172"/>
+      <w:bookmarkEnd w:id="15"/>
       <w:r>
         <w:rPr/>
         <w:t>Paging</w:t>
@@ -3598,13 +3438,13 @@
         <w:pStyle w:val="Heading3"/>
         <w:numPr>
           <w:ilvl w:val="2"/>
-          <w:numId w:val="1"/>
+          <w:numId w:val="2"/>
         </w:numPr>
         <w:ind w:hanging="0" w:start="0"/>
         <w:rPr/>
       </w:pPr>
-      <w:bookmarkStart w:id="19" w:name="__RefHeading___Toc3258_1306602172"/>
-      <w:bookmarkEnd w:id="19"/>
+      <w:bookmarkStart w:id="16" w:name="__RefHeading___Toc3258_1306602172"/>
+      <w:bookmarkEnd w:id="16"/>
       <w:r>
         <w:rPr/>
         <w:t>Page Directory</w:t>
@@ -3625,13 +3465,13 @@
         <w:pStyle w:val="Heading3"/>
         <w:numPr>
           <w:ilvl w:val="2"/>
-          <w:numId w:val="1"/>
+          <w:numId w:val="2"/>
         </w:numPr>
         <w:ind w:hanging="0" w:start="0"/>
         <w:rPr/>
       </w:pPr>
-      <w:bookmarkStart w:id="20" w:name="__RefHeading___Toc3260_1306602172"/>
-      <w:bookmarkEnd w:id="20"/>
+      <w:bookmarkStart w:id="17" w:name="__RefHeading___Toc3260_1306602172"/>
+      <w:bookmarkEnd w:id="17"/>
       <w:r>
         <w:rPr/>
         <w:t>Page Tables</w:t>
@@ -3661,13 +3501,13 @@
         <w:pStyle w:val="Heading1"/>
         <w:numPr>
           <w:ilvl w:val="0"/>
-          <w:numId w:val="1"/>
+          <w:numId w:val="2"/>
         </w:numPr>
         <w:ind w:hanging="0" w:start="0"/>
         <w:rPr/>
       </w:pPr>
-      <w:bookmarkStart w:id="21" w:name="__RefHeading___Toc3178_577436461"/>
-      <w:bookmarkEnd w:id="21"/>
+      <w:bookmarkStart w:id="18" w:name="__RefHeading___Toc3178_577436461"/>
+      <w:bookmarkEnd w:id="18"/>
       <w:r>
         <w:rPr/>
         <w:t>System Entry Point Table (SEPT/syscall)</w:t>
@@ -3686,7 +3526,7 @@
       <w:tblPr>
         <w:tblW w:w="9969" w:type="dxa"/>
         <w:jc w:val="start"/>
-        <w:tblInd w:w="0" w:type="dxa"/>
+        <w:tblInd w:w="-14" w:type="dxa"/>
         <w:tblLayout w:type="fixed"/>
         <w:tblCellMar>
           <w:top w:w="0" w:type="dxa"/>
@@ -7646,13 +7486,13 @@
         <w:pStyle w:val="Heading1"/>
         <w:numPr>
           <w:ilvl w:val="0"/>
-          <w:numId w:val="1"/>
+          <w:numId w:val="2"/>
         </w:numPr>
         <w:ind w:hanging="0" w:start="0"/>
         <w:rPr/>
       </w:pPr>
-      <w:bookmarkStart w:id="22" w:name="__RefHeading___Toc216_163282470"/>
-      <w:bookmarkEnd w:id="22"/>
+      <w:bookmarkStart w:id="19" w:name="__RefHeading___Toc216_163282470"/>
+      <w:bookmarkEnd w:id="19"/>
       <w:r>
         <w:rPr/>
         <w:t>Libraries</w:t>
@@ -7663,13 +7503,13 @@
         <w:pStyle w:val="Heading2"/>
         <w:numPr>
           <w:ilvl w:val="1"/>
-          <w:numId w:val="1"/>
+          <w:numId w:val="2"/>
         </w:numPr>
         <w:ind w:hanging="0" w:start="0"/>
         <w:rPr/>
       </w:pPr>
-      <w:bookmarkStart w:id="23" w:name="__RefHeading___Toc218_163282470"/>
-      <w:bookmarkEnd w:id="23"/>
+      <w:bookmarkStart w:id="20" w:name="__RefHeading___Toc218_163282470"/>
+      <w:bookmarkEnd w:id="20"/>
       <w:r>
         <w:rPr/>
         <w:t>libc</w:t>
@@ -7680,13 +7520,13 @@
         <w:pStyle w:val="Heading3"/>
         <w:numPr>
           <w:ilvl w:val="2"/>
-          <w:numId w:val="1"/>
+          <w:numId w:val="2"/>
         </w:numPr>
         <w:ind w:hanging="0" w:start="0"/>
         <w:rPr/>
       </w:pPr>
-      <w:bookmarkStart w:id="24" w:name="__RefHeading___Toc3130_3766358001"/>
-      <w:bookmarkEnd w:id="24"/>
+      <w:bookmarkStart w:id="21" w:name="__RefHeading___Toc3130_3766358001"/>
+      <w:bookmarkEnd w:id="21"/>
       <w:r>
         <w:rPr/>
         <w:t>Abort – Abort the kernel</w:t>
@@ -7732,13 +7572,13 @@
         <w:pStyle w:val="Heading3"/>
         <w:numPr>
           <w:ilvl w:val="2"/>
-          <w:numId w:val="1"/>
+          <w:numId w:val="2"/>
         </w:numPr>
         <w:ind w:hanging="0" w:start="0"/>
         <w:rPr/>
       </w:pPr>
-      <w:bookmarkStart w:id="25" w:name="__RefHeading___Toc220_163282470"/>
-      <w:bookmarkEnd w:id="25"/>
+      <w:bookmarkStart w:id="22" w:name="__RefHeading___Toc220_163282470"/>
+      <w:bookmarkEnd w:id="22"/>
       <w:r>
         <w:rPr/>
         <w:t>snprintf – “print” formatted string</w:t>
@@ -7832,13 +7672,13 @@
         <w:pStyle w:val="Heading4"/>
         <w:numPr>
           <w:ilvl w:val="3"/>
-          <w:numId w:val="1"/>
+          <w:numId w:val="2"/>
         </w:numPr>
         <w:ind w:hanging="0" w:start="0"/>
         <w:rPr/>
       </w:pPr>
-      <w:bookmarkStart w:id="26" w:name="__RefHeading___Toc222_163282470"/>
-      <w:bookmarkEnd w:id="26"/>
+      <w:bookmarkStart w:id="23" w:name="__RefHeading___Toc222_163282470"/>
+      <w:bookmarkEnd w:id="23"/>
       <w:r>
         <w:rPr/>
         <w:t>Substitution parameters</w:t>
@@ -8007,13 +7847,13 @@
         <w:pStyle w:val="Heading3"/>
         <w:numPr>
           <w:ilvl w:val="2"/>
-          <w:numId w:val="1"/>
+          <w:numId w:val="2"/>
         </w:numPr>
         <w:ind w:hanging="0" w:start="0" w:end="0"/>
         <w:rPr/>
       </w:pPr>
-      <w:bookmarkStart w:id="27" w:name="__RefHeading___Toc220_1632824702"/>
-      <w:bookmarkEnd w:id="27"/>
+      <w:bookmarkStart w:id="24" w:name="__RefHeading___Toc220_1632824702"/>
+      <w:bookmarkEnd w:id="24"/>
       <w:r>
         <w:rPr/>
         <w:t>trimc – trim a character from the front of a string</w:t>
@@ -8084,13 +7924,13 @@
         <w:pStyle w:val="Heading2"/>
         <w:numPr>
           <w:ilvl w:val="1"/>
-          <w:numId w:val="1"/>
+          <w:numId w:val="2"/>
         </w:numPr>
         <w:ind w:hanging="0" w:start="0"/>
         <w:rPr/>
       </w:pPr>
-      <w:bookmarkStart w:id="28" w:name="__RefHeading___Toc3133_3766358001"/>
-      <w:bookmarkEnd w:id="28"/>
+      <w:bookmarkStart w:id="25" w:name="__RefHeading___Toc3133_3766358001"/>
+      <w:bookmarkEnd w:id="25"/>
       <w:r>
         <w:rPr/>
         <w:t>libkrnl</w:t>
@@ -8101,13 +7941,13 @@
         <w:pStyle w:val="Heading3"/>
         <w:numPr>
           <w:ilvl w:val="2"/>
-          <w:numId w:val="1"/>
+          <w:numId w:val="2"/>
         </w:numPr>
         <w:ind w:hanging="0" w:start="0"/>
         <w:rPr/>
       </w:pPr>
-      <w:bookmarkStart w:id="29" w:name="__RefHeading___Toc3155_3766358001"/>
-      <w:bookmarkEnd w:id="29"/>
+      <w:bookmarkStart w:id="26" w:name="__RefHeading___Toc3155_3766358001"/>
+      <w:bookmarkEnd w:id="26"/>
       <w:r>
         <w:rPr/>
         <w:t>bcd_to_bin – Convert a Binary Coded Decimal (BCD) digit to binary</w:t>
@@ -8179,13 +8019,13 @@
         <w:pStyle w:val="Heading3"/>
         <w:numPr>
           <w:ilvl w:val="2"/>
-          <w:numId w:val="1"/>
+          <w:numId w:val="2"/>
         </w:numPr>
         <w:ind w:hanging="0" w:start="0"/>
         <w:rPr/>
       </w:pPr>
-      <w:bookmarkStart w:id="30" w:name="__RefHeading___Toc3135_3766358001"/>
-      <w:bookmarkEnd w:id="30"/>
+      <w:bookmarkStart w:id="27" w:name="__RefHeading___Toc3135_3766358001"/>
+      <w:bookmarkEnd w:id="27"/>
       <w:r>
         <w:rPr/>
         <w:t>getSelectorText – Get a text string for the selector provided</w:t>
@@ -8296,13 +8136,13 @@
         <w:pStyle w:val="Heading3"/>
         <w:numPr>
           <w:ilvl w:val="2"/>
-          <w:numId w:val="1"/>
+          <w:numId w:val="2"/>
         </w:numPr>
         <w:ind w:hanging="0" w:start="0"/>
         <w:rPr/>
       </w:pPr>
-      <w:bookmarkStart w:id="31" w:name="__RefHeading___Toc3137_3766358001"/>
-      <w:bookmarkEnd w:id="31"/>
+      <w:bookmarkStart w:id="28" w:name="__RefHeading___Toc3137_3766358001"/>
+      <w:bookmarkEnd w:id="28"/>
       <w:r>
         <w:rPr/>
         <w:t>kmalloc – Allocate space from the heap for the kernel</w:t>
@@ -8390,13 +8230,13 @@
         <w:pStyle w:val="Heading3"/>
         <w:numPr>
           <w:ilvl w:val="2"/>
-          <w:numId w:val="1"/>
+          <w:numId w:val="2"/>
         </w:numPr>
         <w:ind w:hanging="0" w:start="0"/>
         <w:rPr/>
       </w:pPr>
-      <w:bookmarkStart w:id="32" w:name="__RefHeading___Toc3139_3766358001"/>
-      <w:bookmarkEnd w:id="32"/>
+      <w:bookmarkStart w:id="29" w:name="__RefHeading___Toc3139_3766358001"/>
+      <w:bookmarkEnd w:id="29"/>
       <w:r>
         <w:rPr/>
         <w:t>kfree – Return space to the heap</w:t>
@@ -8468,13 +8308,13 @@
         <w:pStyle w:val="Heading3"/>
         <w:numPr>
           <w:ilvl w:val="2"/>
-          <w:numId w:val="1"/>
+          <w:numId w:val="2"/>
         </w:numPr>
         <w:ind w:hanging="0" w:start="0"/>
         <w:rPr/>
       </w:pPr>
-      <w:bookmarkStart w:id="33" w:name="__RefHeading___Toc3141_3766358001"/>
-      <w:bookmarkEnd w:id="33"/>
+      <w:bookmarkStart w:id="30" w:name="__RefHeading___Toc3141_3766358001"/>
+      <w:bookmarkEnd w:id="30"/>
       <w:r>
         <w:rPr/>
         <w:t>getPortByte – Return a byte(unsigned char) from a port</w:t>
@@ -8485,13 +8325,13 @@
         <w:pStyle w:val="Heading3"/>
         <w:numPr>
           <w:ilvl w:val="2"/>
-          <w:numId w:val="1"/>
+          <w:numId w:val="2"/>
         </w:numPr>
         <w:ind w:hanging="0" w:start="0"/>
         <w:rPr/>
       </w:pPr>
-      <w:bookmarkStart w:id="34" w:name="__RefHeading___Toc3143_3766358001"/>
-      <w:bookmarkEnd w:id="34"/>
+      <w:bookmarkStart w:id="31" w:name="__RefHeading___Toc3143_3766358001"/>
+      <w:bookmarkEnd w:id="31"/>
       <w:r>
         <w:rPr/>
         <w:t>getPortWord – Return a uint16_t from a port</w:t>
@@ -8502,13 +8342,13 @@
         <w:pStyle w:val="Heading3"/>
         <w:numPr>
           <w:ilvl w:val="2"/>
-          <w:numId w:val="1"/>
+          <w:numId w:val="2"/>
         </w:numPr>
         <w:ind w:hanging="0" w:start="0"/>
         <w:rPr/>
       </w:pPr>
-      <w:bookmarkStart w:id="35" w:name="__RefHeading___Toc3145_3766358001"/>
-      <w:bookmarkEnd w:id="35"/>
+      <w:bookmarkStart w:id="32" w:name="__RefHeading___Toc3145_3766358001"/>
+      <w:bookmarkEnd w:id="32"/>
       <w:r>
         <w:rPr/>
         <w:t>getPortLong – Return a uint32_t from a port</w:t>
@@ -8585,13 +8425,13 @@
         <w:widowControl w:val="false"/>
         <w:numPr>
           <w:ilvl w:val="2"/>
-          <w:numId w:val="1"/>
+          <w:numId w:val="2"/>
         </w:numPr>
         <w:ind w:hanging="0" w:start="0"/>
         <w:rPr/>
       </w:pPr>
-      <w:bookmarkStart w:id="36" w:name="__RefHeading___Toc3147_3766358001"/>
-      <w:bookmarkEnd w:id="36"/>
+      <w:bookmarkStart w:id="33" w:name="__RefHeading___Toc3147_3766358001"/>
+      <w:bookmarkEnd w:id="33"/>
       <w:r>
         <w:rPr/>
         <w:t>putPortByte – Put an unsigned char to a port</w:t>
@@ -8605,13 +8445,13 @@
         <w:widowControl w:val="false"/>
         <w:numPr>
           <w:ilvl w:val="2"/>
-          <w:numId w:val="1"/>
+          <w:numId w:val="2"/>
         </w:numPr>
         <w:ind w:hanging="0" w:start="0"/>
         <w:rPr/>
       </w:pPr>
-      <w:bookmarkStart w:id="37" w:name="__RefHeading___Toc3149_3766358001"/>
-      <w:bookmarkEnd w:id="37"/>
+      <w:bookmarkStart w:id="34" w:name="__RefHeading___Toc3149_3766358001"/>
+      <w:bookmarkEnd w:id="34"/>
       <w:r>
         <w:rPr/>
         <w:t>putPortWord – Put a uint16_t value to a port</w:t>
@@ -8625,13 +8465,13 @@
         <w:widowControl w:val="false"/>
         <w:numPr>
           <w:ilvl w:val="2"/>
-          <w:numId w:val="1"/>
+          <w:numId w:val="2"/>
         </w:numPr>
         <w:ind w:hanging="0" w:start="0"/>
         <w:rPr/>
       </w:pPr>
-      <w:bookmarkStart w:id="38" w:name="__RefHeading___Toc3151_3766358001"/>
-      <w:bookmarkEnd w:id="38"/>
+      <w:bookmarkStart w:id="35" w:name="__RefHeading___Toc3151_3766358001"/>
+      <w:bookmarkEnd w:id="35"/>
       <w:r>
         <w:rPr/>
         <w:t>putPortLong – Put a uint32_2 value to a port</w:t>
@@ -8740,13 +8580,13 @@
         <w:pStyle w:val="Heading3"/>
         <w:numPr>
           <w:ilvl w:val="2"/>
-          <w:numId w:val="1"/>
+          <w:numId w:val="2"/>
         </w:numPr>
         <w:ind w:hanging="0" w:start="0"/>
         <w:rPr/>
       </w:pPr>
-      <w:bookmarkStart w:id="39" w:name="__RefHeading___Toc3157_3766358001"/>
-      <w:bookmarkEnd w:id="39"/>
+      <w:bookmarkStart w:id="36" w:name="__RefHeading___Toc3157_3766358001"/>
+      <w:bookmarkEnd w:id="36"/>
       <w:r>
         <w:rPr/>
         <w:t>rdtsc – Read the timestamp counter</w:t>
@@ -8818,13 +8658,13 @@
         <w:pStyle w:val="Heading3"/>
         <w:numPr>
           <w:ilvl w:val="2"/>
-          <w:numId w:val="1"/>
+          <w:numId w:val="2"/>
         </w:numPr>
         <w:ind w:hanging="0" w:start="0"/>
         <w:rPr/>
       </w:pPr>
-      <w:bookmarkStart w:id="40" w:name="__RefHeading___Toc3159_3766358001"/>
-      <w:bookmarkEnd w:id="40"/>
+      <w:bookmarkStart w:id="37" w:name="__RefHeading___Toc3159_3766358001"/>
+      <w:bookmarkEnd w:id="37"/>
       <w:r>
         <w:rPr/>
         <w:t>read_system_clock – Get the system time</w:t>
@@ -8906,13 +8746,13 @@
         <w:pStyle w:val="Heading3"/>
         <w:numPr>
           <w:ilvl w:val="2"/>
-          <w:numId w:val="1"/>
+          <w:numId w:val="2"/>
         </w:numPr>
         <w:ind w:hanging="0" w:start="0"/>
         <w:rPr/>
       </w:pPr>
-      <w:bookmarkStart w:id="41" w:name="__RefHeading___Toc3153_3766358001"/>
-      <w:bookmarkEnd w:id="41"/>
+      <w:bookmarkStart w:id="38" w:name="__RefHeading___Toc3153_3766358001"/>
+      <w:bookmarkEnd w:id="38"/>
       <w:r>
         <w:rPr/>
         <w:t>reboot – Reboot the system</w:t>
@@ -8994,14 +8834,14 @@
         <w:pStyle w:val="Heading1"/>
         <w:numPr>
           <w:ilvl w:val="0"/>
-          <w:numId w:val="1"/>
+          <w:numId w:val="2"/>
         </w:numPr>
         <w:spacing w:before="0" w:after="120"/>
         <w:ind w:hanging="0" w:start="0"/>
         <w:rPr/>
       </w:pPr>
-      <w:bookmarkStart w:id="42" w:name="__RefHeading___Toc92_163282470"/>
-      <w:bookmarkEnd w:id="42"/>
+      <w:bookmarkStart w:id="39" w:name="__RefHeading___Toc92_163282470"/>
+      <w:bookmarkEnd w:id="39"/>
       <w:r>
         <w:rPr/>
         <w:t>Appendices</w:t>
@@ -9012,13 +8852,13 @@
         <w:pStyle w:val="Heading2"/>
         <w:numPr>
           <w:ilvl w:val="1"/>
-          <w:numId w:val="1"/>
+          <w:numId w:val="2"/>
         </w:numPr>
         <w:ind w:hanging="0" w:start="0"/>
         <w:rPr/>
       </w:pPr>
-      <w:bookmarkStart w:id="43" w:name="__RefHeading___Toc224_163282470"/>
-      <w:bookmarkEnd w:id="43"/>
+      <w:bookmarkStart w:id="40" w:name="__RefHeading___Toc224_163282470"/>
+      <w:bookmarkEnd w:id="40"/>
       <w:r>
         <w:rPr/>
         <w:t>Memory map</w:t>
@@ -9028,7 +8868,7 @@
       <w:tblPr>
         <w:tblW w:w="9969" w:type="dxa"/>
         <w:jc w:val="start"/>
-        <w:tblInd w:w="0" w:type="dxa"/>
+        <w:tblInd w:w="-14" w:type="dxa"/>
         <w:tblLayout w:type="fixed"/>
         <w:tblCellMar>
           <w:top w:w="0" w:type="dxa"/>
@@ -9936,7 +9776,21 @@
             <w:pPr>
               <w:pStyle w:val="TableContents"/>
               <w:jc w:val="start"/>
-              <w:rPr/>
+              <w:rPr>
+                <w:rFonts w:ascii="Liberation Sans;Arial" w:hAnsi="Liberation Sans;Arial" w:cs="Liberation Sans;Arial"/>
+                <w:b w:val="false"/>
+                <w:bCs w:val="false"/>
+                <w:i w:val="false"/>
+                <w:iCs w:val="false"/>
+                <w:strike w:val="false"/>
+                <w:dstrike w:val="false"/>
+                <w:outline w:val="false"/>
+                <w:shadow w:val="false"/>
+                <w:color w:val="000000"/>
+                <w:sz w:val="24"/>
+                <w:szCs w:val="24"/>
+                <w:u w:val="none"/>
+              </w:rPr>
             </w:pPr>
             <w:r>
               <w:rPr>
@@ -11518,7 +11372,21 @@
               <w:pStyle w:val="TableContents"/>
               <w:snapToGrid w:val="false"/>
               <w:jc w:val="start"/>
-              <w:rPr/>
+              <w:rPr>
+                <w:rFonts w:ascii="Liberation Sans;Arial" w:hAnsi="Liberation Sans;Arial" w:cs="Liberation Sans;Arial"/>
+                <w:b w:val="false"/>
+                <w:bCs w:val="false"/>
+                <w:i w:val="false"/>
+                <w:iCs w:val="false"/>
+                <w:strike w:val="false"/>
+                <w:dstrike w:val="false"/>
+                <w:outline w:val="false"/>
+                <w:shadow w:val="false"/>
+                <w:color w:val="000000"/>
+                <w:sz w:val="24"/>
+                <w:szCs w:val="24"/>
+                <w:u w:val="none"/>
+              </w:rPr>
             </w:pPr>
             <w:r>
               <w:rPr>
@@ -19272,13 +19140,13 @@
         <w:pStyle w:val="Heading2"/>
         <w:numPr>
           <w:ilvl w:val="1"/>
-          <w:numId w:val="1"/>
+          <w:numId w:val="2"/>
         </w:numPr>
         <w:ind w:hanging="0" w:start="0"/>
         <w:rPr/>
       </w:pPr>
-      <w:bookmarkStart w:id="44" w:name="__RefHeading___Toc94_163282470"/>
-      <w:bookmarkEnd w:id="44"/>
+      <w:bookmarkStart w:id="41" w:name="__RefHeading___Toc94_163282470"/>
+      <w:bookmarkEnd w:id="41"/>
       <w:r>
         <w:rPr/>
         <w:t>Interrupts</w:t>
@@ -19288,7 +19156,7 @@
       <w:tblPr>
         <w:tblW w:w="9969" w:type="dxa"/>
         <w:jc w:val="start"/>
-        <w:tblInd w:w="0" w:type="dxa"/>
+        <w:tblInd w:w="-14" w:type="dxa"/>
         <w:tblLayout w:type="fixed"/>
         <w:tblCellMar>
           <w:top w:w="0" w:type="dxa"/>
@@ -27490,13 +27358,13 @@
         <w:pStyle w:val="Heading2"/>
         <w:numPr>
           <w:ilvl w:val="1"/>
-          <w:numId w:val="1"/>
+          <w:numId w:val="2"/>
         </w:numPr>
         <w:ind w:hanging="0" w:start="0"/>
         <w:rPr/>
       </w:pPr>
-      <w:bookmarkStart w:id="45" w:name="__RefHeading___Toc237_163282470"/>
-      <w:bookmarkEnd w:id="45"/>
+      <w:bookmarkStart w:id="42" w:name="__RefHeading___Toc237_163282470"/>
+      <w:bookmarkEnd w:id="42"/>
       <w:r>
         <w:rPr/>
         <w:t>Globals</w:t>
@@ -27507,13 +27375,13 @@
         <w:pStyle w:val="Heading3"/>
         <w:numPr>
           <w:ilvl w:val="2"/>
-          <w:numId w:val="1"/>
+          <w:numId w:val="2"/>
         </w:numPr>
         <w:ind w:hanging="0" w:start="0"/>
         <w:rPr/>
       </w:pPr>
-      <w:bookmarkStart w:id="46" w:name="__RefHeading___Toc239_163282470"/>
-      <w:bookmarkEnd w:id="46"/>
+      <w:bookmarkStart w:id="43" w:name="__RefHeading___Toc239_163282470"/>
+      <w:bookmarkEnd w:id="43"/>
       <w:r>
         <w:rPr/>
         <w:t>Functions</w:t>
@@ -27524,13 +27392,13 @@
         <w:pStyle w:val="Heading4"/>
         <w:numPr>
           <w:ilvl w:val="3"/>
-          <w:numId w:val="1"/>
+          <w:numId w:val="2"/>
         </w:numPr>
         <w:ind w:hanging="0" w:start="0"/>
         <w:rPr/>
       </w:pPr>
-      <w:bookmarkStart w:id="47" w:name="__RefHeading___Toc260_163282470"/>
-      <w:bookmarkEnd w:id="47"/>
+      <w:bookmarkStart w:id="44" w:name="__RefHeading___Toc260_163282470"/>
+      <w:bookmarkEnd w:id="44"/>
       <w:r>
         <w:rPr/>
         <w:t>boot.S</w:t>
@@ -27580,13 +27448,13 @@
         <w:pStyle w:val="Heading4"/>
         <w:numPr>
           <w:ilvl w:val="3"/>
-          <w:numId w:val="1"/>
+          <w:numId w:val="2"/>
         </w:numPr>
         <w:ind w:hanging="0" w:start="0"/>
         <w:rPr/>
       </w:pPr>
-      <w:bookmarkStart w:id="48" w:name="__RefHeading___Toc241_163282470"/>
-      <w:bookmarkEnd w:id="48"/>
+      <w:bookmarkStart w:id="45" w:name="__RefHeading___Toc241_163282470"/>
+      <w:bookmarkEnd w:id="45"/>
       <w:r>
         <w:rPr/>
         <w:t>Console Commands</w:t>
@@ -27607,13 +27475,13 @@
         <w:pStyle w:val="Heading4"/>
         <w:numPr>
           <w:ilvl w:val="3"/>
-          <w:numId w:val="1"/>
+          <w:numId w:val="2"/>
         </w:numPr>
         <w:ind w:hanging="0" w:start="0"/>
         <w:rPr/>
       </w:pPr>
-      <w:bookmarkStart w:id="49" w:name="__RefHeading___Toc243_163282470"/>
-      <w:bookmarkEnd w:id="49"/>
+      <w:bookmarkStart w:id="46" w:name="__RefHeading___Toc243_163282470"/>
+      <w:bookmarkEnd w:id="46"/>
       <w:r>
         <w:rPr/>
         <w:t>Interrupt Descriptor Table (IDT)</w:t>
@@ -27864,13 +27732,13 @@
         <w:pStyle w:val="Heading4"/>
         <w:numPr>
           <w:ilvl w:val="3"/>
-          <w:numId w:val="1"/>
+          <w:numId w:val="2"/>
         </w:numPr>
         <w:ind w:hanging="0" w:start="0"/>
         <w:rPr/>
       </w:pPr>
-      <w:bookmarkStart w:id="50" w:name="__RefHeading___Toc262_163282470"/>
-      <w:bookmarkEnd w:id="50"/>
+      <w:bookmarkStart w:id="47" w:name="__RefHeading___Toc262_163282470"/>
+      <w:bookmarkEnd w:id="47"/>
       <w:r>
         <w:rPr/>
         <w:t>Kernel</w:t>
@@ -27931,13 +27799,13 @@
         <w:pStyle w:val="Heading4"/>
         <w:numPr>
           <w:ilvl w:val="3"/>
-          <w:numId w:val="1"/>
+          <w:numId w:val="2"/>
         </w:numPr>
         <w:ind w:hanging="0" w:start="0"/>
         <w:rPr/>
       </w:pPr>
-      <w:bookmarkStart w:id="51" w:name="__RefHeading___Toc264_163282470"/>
-      <w:bookmarkEnd w:id="51"/>
+      <w:bookmarkStart w:id="48" w:name="__RefHeading___Toc264_163282470"/>
+      <w:bookmarkEnd w:id="48"/>
       <w:r>
         <w:rPr/>
         <w:t>Multiboot information</w:t>
@@ -27958,13 +27826,13 @@
         <w:pStyle w:val="Heading4"/>
         <w:numPr>
           <w:ilvl w:val="3"/>
-          <w:numId w:val="1"/>
+          <w:numId w:val="2"/>
         </w:numPr>
         <w:ind w:hanging="0" w:start="0"/>
         <w:rPr/>
       </w:pPr>
-      <w:bookmarkStart w:id="52" w:name="__RefHeading___Toc272_163282470"/>
-      <w:bookmarkEnd w:id="52"/>
+      <w:bookmarkStart w:id="49" w:name="__RefHeading___Toc272_163282470"/>
+      <w:bookmarkEnd w:id="49"/>
       <w:r>
         <w:rPr/>
         <w:t>Paging</w:t>
@@ -27985,13 +27853,13 @@
         <w:pStyle w:val="Heading3"/>
         <w:numPr>
           <w:ilvl w:val="2"/>
-          <w:numId w:val="1"/>
+          <w:numId w:val="2"/>
         </w:numPr>
         <w:ind w:hanging="0" w:start="0"/>
         <w:rPr/>
       </w:pPr>
-      <w:bookmarkStart w:id="53" w:name="__RefHeading___Toc266_163282470"/>
-      <w:bookmarkEnd w:id="53"/>
+      <w:bookmarkStart w:id="50" w:name="__RefHeading___Toc266_163282470"/>
+      <w:bookmarkEnd w:id="50"/>
       <w:r>
         <w:rPr/>
         <w:t>Variables</w:t>
@@ -28002,13 +27870,13 @@
         <w:pStyle w:val="Heading4"/>
         <w:numPr>
           <w:ilvl w:val="3"/>
-          <w:numId w:val="1"/>
+          <w:numId w:val="2"/>
         </w:numPr>
         <w:ind w:hanging="0" w:start="0"/>
         <w:rPr/>
       </w:pPr>
-      <w:bookmarkStart w:id="54" w:name="__RefHeading___Toc268_163282470"/>
-      <w:bookmarkEnd w:id="54"/>
+      <w:bookmarkStart w:id="51" w:name="__RefHeading___Toc268_163282470"/>
+      <w:bookmarkEnd w:id="51"/>
       <w:r>
         <w:rPr/>
         <w:t>boot.S</w:t>
@@ -28039,13 +27907,13 @@
         <w:pStyle w:val="Heading4"/>
         <w:numPr>
           <w:ilvl w:val="3"/>
-          <w:numId w:val="1"/>
+          <w:numId w:val="2"/>
         </w:numPr>
         <w:ind w:hanging="0" w:start="0"/>
         <w:rPr/>
       </w:pPr>
-      <w:bookmarkStart w:id="55" w:name="__RefHeading___Toc245_163282470"/>
-      <w:bookmarkEnd w:id="55"/>
+      <w:bookmarkStart w:id="52" w:name="__RefHeading___Toc245_163282470"/>
+      <w:bookmarkEnd w:id="52"/>
       <w:r>
         <w:rPr/>
         <w:t>Global Descriptor Table (GDT)</w:t>
@@ -28136,13 +28004,13 @@
         <w:pStyle w:val="Heading4"/>
         <w:numPr>
           <w:ilvl w:val="3"/>
-          <w:numId w:val="1"/>
+          <w:numId w:val="2"/>
         </w:numPr>
         <w:ind w:hanging="0" w:start="0"/>
         <w:rPr/>
       </w:pPr>
-      <w:bookmarkStart w:id="56" w:name="__RefHeading___Toc247_163282470"/>
-      <w:bookmarkEnd w:id="56"/>
+      <w:bookmarkStart w:id="53" w:name="__RefHeading___Toc247_163282470"/>
+      <w:bookmarkEnd w:id="53"/>
       <w:r>
         <w:rPr/>
         <w:t>Heap</w:t>
@@ -28153,7 +28021,7 @@
         <w:pStyle w:val="Heading5"/>
         <w:numPr>
           <w:ilvl w:val="4"/>
-          <w:numId w:val="1"/>
+          <w:numId w:val="2"/>
         </w:numPr>
         <w:ind w:hanging="0" w:start="0"/>
         <w:rPr/>
@@ -28168,7 +28036,7 @@
         <w:pStyle w:val="Heading5"/>
         <w:numPr>
           <w:ilvl w:val="4"/>
-          <w:numId w:val="1"/>
+          <w:numId w:val="2"/>
         </w:numPr>
         <w:ind w:hanging="0" w:start="0"/>
         <w:rPr/>
@@ -28183,13 +28051,13 @@
         <w:pStyle w:val="Heading4"/>
         <w:numPr>
           <w:ilvl w:val="3"/>
-          <w:numId w:val="1"/>
+          <w:numId w:val="2"/>
         </w:numPr>
         <w:ind w:hanging="0" w:start="0"/>
         <w:rPr/>
       </w:pPr>
-      <w:bookmarkStart w:id="57" w:name="__RefHeading___Toc253_163282470"/>
-      <w:bookmarkEnd w:id="57"/>
+      <w:bookmarkStart w:id="54" w:name="__RefHeading___Toc253_163282470"/>
+      <w:bookmarkEnd w:id="54"/>
       <w:r>
         <w:rPr/>
         <w:t>Interrupt Descriptor Table (IDT)</w:t>
@@ -28220,13 +28088,13 @@
         <w:pStyle w:val="Heading4"/>
         <w:numPr>
           <w:ilvl w:val="3"/>
-          <w:numId w:val="1"/>
+          <w:numId w:val="2"/>
         </w:numPr>
         <w:ind w:hanging="0" w:start="0"/>
         <w:rPr/>
       </w:pPr>
-      <w:bookmarkStart w:id="58" w:name="__RefHeading___Toc270_163282470"/>
-      <w:bookmarkEnd w:id="58"/>
+      <w:bookmarkStart w:id="55" w:name="__RefHeading___Toc270_163282470"/>
+      <w:bookmarkEnd w:id="55"/>
       <w:r>
         <w:rPr/>
         <w:t>Kernel</w:t>
@@ -28267,13 +28135,13 @@
         <w:pStyle w:val="Heading4"/>
         <w:numPr>
           <w:ilvl w:val="3"/>
-          <w:numId w:val="1"/>
+          <w:numId w:val="2"/>
         </w:numPr>
         <w:ind w:hanging="0" w:start="0"/>
         <w:rPr/>
       </w:pPr>
-      <w:bookmarkStart w:id="59" w:name="__RefHeading___Toc255_163282470"/>
-      <w:bookmarkEnd w:id="59"/>
+      <w:bookmarkStart w:id="56" w:name="__RefHeading___Toc255_163282470"/>
+      <w:bookmarkEnd w:id="56"/>
       <w:r>
         <w:rPr/>
         <w:t>Multiboot information (GRUB)</w:t>
@@ -28374,13 +28242,13 @@
         <w:pStyle w:val="Heading4"/>
         <w:numPr>
           <w:ilvl w:val="3"/>
-          <w:numId w:val="1"/>
+          <w:numId w:val="2"/>
         </w:numPr>
         <w:ind w:hanging="0" w:start="0"/>
         <w:rPr/>
       </w:pPr>
-      <w:bookmarkStart w:id="60" w:name="__RefHeading___Toc274_163282470"/>
-      <w:bookmarkEnd w:id="60"/>
+      <w:bookmarkStart w:id="57" w:name="__RefHeading___Toc274_163282470"/>
+      <w:bookmarkEnd w:id="57"/>
       <w:r>
         <w:rPr/>
         <w:t>Paging</w:t>
@@ -28410,15 +28278,15 @@
         <w:pStyle w:val="Heading1"/>
         <w:numPr>
           <w:ilvl w:val="0"/>
-          <w:numId w:val="1"/>
+          <w:numId w:val="2"/>
         </w:numPr>
         <w:bidi w:val="0"/>
         <w:ind w:hanging="0" w:start="0"/>
         <w:jc w:val="start"/>
         <w:rPr/>
       </w:pPr>
-      <w:bookmarkStart w:id="61" w:name="__RefHeading___Toc273_3285181658"/>
-      <w:bookmarkEnd w:id="61"/>
+      <w:bookmarkStart w:id="58" w:name="__RefHeading___Toc273_3285181658"/>
+      <w:bookmarkEnd w:id="58"/>
       <w:r>
         <w:rPr/>
         <w:t>Notes</w:t>
@@ -28489,15 +28357,15 @@
         <w:pStyle w:val="Heading2"/>
         <w:numPr>
           <w:ilvl w:val="1"/>
-          <w:numId w:val="1"/>
+          <w:numId w:val="2"/>
         </w:numPr>
         <w:bidi w:val="0"/>
         <w:ind w:hanging="0" w:start="0"/>
         <w:jc w:val="start"/>
         <w:rPr/>
       </w:pPr>
-      <w:bookmarkStart w:id="62" w:name="__RefHeading___Toc97_163282470"/>
-      <w:bookmarkEnd w:id="62"/>
+      <w:bookmarkStart w:id="59" w:name="__RefHeading___Toc97_163282470"/>
+      <w:bookmarkEnd w:id="59"/>
       <w:r>
         <w:rPr/>
         <w:t>Keyboard Driver</w:t>
@@ -28508,13 +28376,13 @@
         <w:pStyle w:val="Heading3"/>
         <w:numPr>
           <w:ilvl w:val="2"/>
-          <w:numId w:val="1"/>
+          <w:numId w:val="2"/>
         </w:numPr>
         <w:ind w:hanging="0" w:start="0"/>
         <w:rPr/>
       </w:pPr>
-      <w:bookmarkStart w:id="63" w:name="__RefHeading___Toc99_163282470"/>
-      <w:bookmarkEnd w:id="63"/>
+      <w:bookmarkStart w:id="60" w:name="__RefHeading___Toc99_163282470"/>
+      <w:bookmarkEnd w:id="60"/>
       <w:r>
         <w:rPr/>
         <w:t>Required functions</w:t>
@@ -28525,13 +28393,13 @@
         <w:pStyle w:val="Heading4"/>
         <w:numPr>
           <w:ilvl w:val="3"/>
-          <w:numId w:val="1"/>
+          <w:numId w:val="2"/>
         </w:numPr>
         <w:ind w:hanging="0" w:start="0"/>
         <w:rPr/>
       </w:pPr>
-      <w:bookmarkStart w:id="64" w:name="__RefHeading___Toc101_163282470"/>
-      <w:bookmarkEnd w:id="64"/>
+      <w:bookmarkStart w:id="61" w:name="__RefHeading___Toc101_163282470"/>
+      <w:bookmarkEnd w:id="61"/>
       <w:r>
         <w:rPr/>
         <w:t>bool kbdInit() -- initialize keyboard</w:t>
@@ -28542,13 +28410,13 @@
         <w:pStyle w:val="Heading4"/>
         <w:numPr>
           <w:ilvl w:val="3"/>
-          <w:numId w:val="1"/>
+          <w:numId w:val="2"/>
         </w:numPr>
         <w:ind w:hanging="0" w:start="0"/>
         <w:rPr/>
       </w:pPr>
-      <w:bookmarkStart w:id="65" w:name="__RefHeading___Toc103_163282470"/>
-      <w:bookmarkEnd w:id="65"/>
+      <w:bookmarkStart w:id="62" w:name="__RefHeading___Toc103_163282470"/>
+      <w:bookmarkEnd w:id="62"/>
       <w:r>
         <w:rPr/>
         <w:t>bool kbdBufferFull() -- returns true if keyboard buffer is full</w:t>
@@ -28559,13 +28427,13 @@
         <w:pStyle w:val="Heading4"/>
         <w:numPr>
           <w:ilvl w:val="3"/>
-          <w:numId w:val="1"/>
+          <w:numId w:val="2"/>
         </w:numPr>
         <w:ind w:hanging="0" w:start="0"/>
         <w:rPr/>
       </w:pPr>
-      <w:bookmarkStart w:id="66" w:name="__RefHeading___Toc105_163282470"/>
-      <w:bookmarkEnd w:id="66"/>
+      <w:bookmarkStart w:id="63" w:name="__RefHeading___Toc105_163282470"/>
+      <w:bookmarkEnd w:id="63"/>
       <w:r>
         <w:rPr/>
         <w:t>bool kbdBufferEmpty() -- returns true if the keyboard buffer is empty</w:t>
@@ -28576,13 +28444,13 @@
         <w:pStyle w:val="Heading4"/>
         <w:numPr>
           <w:ilvl w:val="3"/>
-          <w:numId w:val="1"/>
+          <w:numId w:val="2"/>
         </w:numPr>
         <w:ind w:hanging="0" w:start="0"/>
         <w:rPr/>
       </w:pPr>
-      <w:bookmarkStart w:id="67" w:name="__RefHeading___Toc107_163282470"/>
-      <w:bookmarkEnd w:id="67"/>
+      <w:bookmarkStart w:id="64" w:name="__RefHeading___Toc107_163282470"/>
+      <w:bookmarkEnd w:id="64"/>
       <w:r>
         <w:rPr/>
         <w:t>uint16_t kbdGetKey() -- get a key from the buffer</w:t>
@@ -28619,13 +28487,13 @@
         <w:pStyle w:val="Heading4"/>
         <w:numPr>
           <w:ilvl w:val="3"/>
-          <w:numId w:val="1"/>
+          <w:numId w:val="2"/>
         </w:numPr>
         <w:ind w:hanging="0" w:start="0"/>
         <w:rPr/>
       </w:pPr>
-      <w:bookmarkStart w:id="68" w:name="__RefHeading___Toc109_163282470"/>
-      <w:bookmarkEnd w:id="68"/>
+      <w:bookmarkStart w:id="65" w:name="__RefHeading___Toc109_163282470"/>
+      <w:bookmarkEnd w:id="65"/>
       <w:r>
         <w:rPr/>
         <w:t>uint16_t kbdPeekKey() -- get the next key from the buffer without consuming it</w:t>
@@ -28662,13 +28530,13 @@
         <w:pStyle w:val="Heading3"/>
         <w:numPr>
           <w:ilvl w:val="2"/>
-          <w:numId w:val="1"/>
+          <w:numId w:val="2"/>
         </w:numPr>
         <w:ind w:hanging="0" w:start="0"/>
         <w:rPr/>
       </w:pPr>
-      <w:bookmarkStart w:id="69" w:name="__RefHeading___Toc111_163282470"/>
-      <w:bookmarkEnd w:id="69"/>
+      <w:bookmarkStart w:id="66" w:name="__RefHeading___Toc111_163282470"/>
+      <w:bookmarkEnd w:id="66"/>
       <w:r>
         <w:rPr/>
         <w:t>Key mappings</w:t>
@@ -28679,13 +28547,13 @@
         <w:pStyle w:val="Heading4"/>
         <w:numPr>
           <w:ilvl w:val="3"/>
-          <w:numId w:val="1"/>
+          <w:numId w:val="2"/>
         </w:numPr>
         <w:ind w:hanging="0" w:start="0"/>
         <w:rPr/>
       </w:pPr>
-      <w:bookmarkStart w:id="70" w:name="__RefHeading___Toc113_163282470"/>
-      <w:bookmarkEnd w:id="70"/>
+      <w:bookmarkStart w:id="67" w:name="__RefHeading___Toc113_163282470"/>
+      <w:bookmarkEnd w:id="67"/>
       <w:r>
         <w:rPr/>
         <w:t>High byte</w:t>
@@ -28740,13 +28608,13 @@
         <w:pStyle w:val="Heading4"/>
         <w:numPr>
           <w:ilvl w:val="3"/>
-          <w:numId w:val="1"/>
+          <w:numId w:val="2"/>
         </w:numPr>
         <w:ind w:hanging="0" w:start="0"/>
         <w:rPr/>
       </w:pPr>
-      <w:bookmarkStart w:id="71" w:name="__RefHeading___Toc115_163282470"/>
-      <w:bookmarkEnd w:id="71"/>
+      <w:bookmarkStart w:id="68" w:name="__RefHeading___Toc115_163282470"/>
+      <w:bookmarkEnd w:id="68"/>
       <w:r>
         <w:rPr/>
         <w:t>Low byte</w:t>
@@ -28768,13 +28636,13 @@
         <w:pStyle w:val="Heading3"/>
         <w:numPr>
           <w:ilvl w:val="2"/>
-          <w:numId w:val="1"/>
+          <w:numId w:val="2"/>
         </w:numPr>
         <w:ind w:hanging="0" w:start="0"/>
         <w:rPr/>
       </w:pPr>
-      <w:bookmarkStart w:id="72" w:name="__RefHeading___Toc117_163282470"/>
-      <w:bookmarkEnd w:id="72"/>
+      <w:bookmarkStart w:id="69" w:name="__RefHeading___Toc117_163282470"/>
+      <w:bookmarkEnd w:id="69"/>
       <w:r>
         <w:rPr/>
         <w:t>Non-ASCII key mappings</w:t>
@@ -28784,7 +28652,7 @@
       <w:tblPr>
         <w:tblW w:w="9969" w:type="dxa"/>
         <w:jc w:val="start"/>
-        <w:tblInd w:w="0" w:type="dxa"/>
+        <w:tblInd w:w="-14" w:type="dxa"/>
         <w:tblLayout w:type="fixed"/>
         <w:tblCellMar>
           <w:top w:w="0" w:type="dxa"/>
@@ -34844,15 +34712,15 @@
         <w:pStyle w:val="Heading2"/>
         <w:numPr>
           <w:ilvl w:val="1"/>
-          <w:numId w:val="1"/>
+          <w:numId w:val="2"/>
         </w:numPr>
         <w:bidi w:val="0"/>
         <w:ind w:hanging="0" w:start="0"/>
         <w:jc w:val="start"/>
         <w:rPr/>
       </w:pPr>
-      <w:bookmarkStart w:id="73" w:name="__RefHeading___Toc275_3285181658"/>
-      <w:bookmarkEnd w:id="73"/>
+      <w:bookmarkStart w:id="70" w:name="__RefHeading___Toc275_3285181658"/>
+      <w:bookmarkEnd w:id="70"/>
       <w:r>
         <w:rPr/>
         <w:t>VGA Driver</w:t>
@@ -34863,15 +34731,15 @@
         <w:pStyle w:val="Heading3"/>
         <w:numPr>
           <w:ilvl w:val="2"/>
-          <w:numId w:val="1"/>
+          <w:numId w:val="2"/>
         </w:numPr>
         <w:bidi w:val="0"/>
         <w:ind w:hanging="0" w:start="0"/>
         <w:jc w:val="start"/>
         <w:rPr/>
       </w:pPr>
-      <w:bookmarkStart w:id="74" w:name="__RefHeading___Toc226_163282470"/>
-      <w:bookmarkEnd w:id="74"/>
+      <w:bookmarkStart w:id="71" w:name="__RefHeading___Toc226_163282470"/>
+      <w:bookmarkEnd w:id="71"/>
       <w:r>
         <w:rPr/>
         <w:t>Public functions</w:t>
@@ -34882,13 +34750,13 @@
         <w:pStyle w:val="Heading3"/>
         <w:numPr>
           <w:ilvl w:val="2"/>
-          <w:numId w:val="1"/>
+          <w:numId w:val="2"/>
         </w:numPr>
         <w:ind w:hanging="0" w:start="0"/>
         <w:rPr/>
       </w:pPr>
-      <w:bookmarkStart w:id="75" w:name="__RefHeading___Toc228_163282470"/>
-      <w:bookmarkEnd w:id="75"/>
+      <w:bookmarkStart w:id="72" w:name="__RefHeading___Toc228_163282470"/>
+      <w:bookmarkEnd w:id="72"/>
       <w:r>
         <w:rPr/>
         <w:t>Public variables</w:t>
@@ -34959,15 +34827,15 @@
         <w:pStyle w:val="Heading3"/>
         <w:numPr>
           <w:ilvl w:val="2"/>
-          <w:numId w:val="1"/>
+          <w:numId w:val="2"/>
         </w:numPr>
         <w:bidi w:val="0"/>
         <w:ind w:hanging="0" w:start="0"/>
         <w:jc w:val="start"/>
         <w:rPr/>
       </w:pPr>
-      <w:bookmarkStart w:id="76" w:name="__RefHeading___Toc230_163282470"/>
-      <w:bookmarkEnd w:id="76"/>
+      <w:bookmarkStart w:id="73" w:name="__RefHeading___Toc230_163282470"/>
+      <w:bookmarkEnd w:id="73"/>
       <w:r>
         <w:rPr/>
         <w:t>Structures</w:t>
@@ -34978,13 +34846,13 @@
         <w:pStyle w:val="Heading4"/>
         <w:numPr>
           <w:ilvl w:val="3"/>
-          <w:numId w:val="1"/>
+          <w:numId w:val="2"/>
         </w:numPr>
         <w:ind w:hanging="0" w:start="0"/>
         <w:rPr/>
       </w:pPr>
-      <w:bookmarkStart w:id="77" w:name="__RefHeading___Toc232_163282470"/>
-      <w:bookmarkEnd w:id="77"/>
+      <w:bookmarkStart w:id="74" w:name="__RefHeading___Toc232_163282470"/>
+      <w:bookmarkEnd w:id="74"/>
       <w:r>
         <w:rPr/>
         <w:t>cursor_pos_t</w:t>
@@ -35049,13 +34917,13 @@
         <w:pStyle w:val="Heading4"/>
         <w:numPr>
           <w:ilvl w:val="3"/>
-          <w:numId w:val="1"/>
+          <w:numId w:val="2"/>
         </w:numPr>
         <w:ind w:hanging="0" w:start="0"/>
         <w:rPr/>
       </w:pPr>
-      <w:bookmarkStart w:id="78" w:name="__RefHeading___Toc234_163282470"/>
-      <w:bookmarkEnd w:id="78"/>
+      <w:bookmarkStart w:id="75" w:name="__RefHeading___Toc234_163282470"/>
+      <w:bookmarkEnd w:id="75"/>
       <w:r>
         <w:rPr/>
         <w:t>vga_cursor_t</w:t>
@@ -35112,15 +34980,15 @@
         <w:pStyle w:val="Heading3"/>
         <w:numPr>
           <w:ilvl w:val="2"/>
-          <w:numId w:val="1"/>
+          <w:numId w:val="2"/>
         </w:numPr>
         <w:bidi w:val="0"/>
         <w:ind w:hanging="0" w:start="0"/>
         <w:jc w:val="start"/>
         <w:rPr/>
       </w:pPr>
-      <w:bookmarkStart w:id="79" w:name="__RefHeading___Toc306_3285181658"/>
-      <w:bookmarkEnd w:id="79"/>
+      <w:bookmarkStart w:id="76" w:name="__RefHeading___Toc306_3285181658"/>
+      <w:bookmarkEnd w:id="76"/>
       <w:r>
         <w:rPr/>
         <w:t>Constants</w:t>
@@ -35131,15 +34999,15 @@
         <w:pStyle w:val="Heading4"/>
         <w:numPr>
           <w:ilvl w:val="3"/>
-          <w:numId w:val="1"/>
+          <w:numId w:val="2"/>
         </w:numPr>
         <w:bidi w:val="0"/>
         <w:ind w:hanging="0" w:start="0"/>
         <w:jc w:val="start"/>
         <w:rPr/>
       </w:pPr>
-      <w:bookmarkStart w:id="80" w:name="__RefHeading___Toc308_3285181658"/>
-      <w:bookmarkEnd w:id="80"/>
+      <w:bookmarkStart w:id="77" w:name="__RefHeading___Toc308_3285181658"/>
+      <w:bookmarkEnd w:id="77"/>
       <w:r>
         <w:rPr/>
         <w:t>CR – Return cursor to column 0</w:t>
@@ -35182,15 +35050,15 @@
         <w:pStyle w:val="Heading4"/>
         <w:numPr>
           <w:ilvl w:val="3"/>
-          <w:numId w:val="1"/>
+          <w:numId w:val="2"/>
         </w:numPr>
         <w:bidi w:val="0"/>
         <w:ind w:hanging="0" w:start="0"/>
         <w:jc w:val="start"/>
         <w:rPr/>
       </w:pPr>
-      <w:bookmarkStart w:id="81" w:name="__RefHeading___Toc310_3285181658"/>
-      <w:bookmarkEnd w:id="81"/>
+      <w:bookmarkStart w:id="78" w:name="__RefHeading___Toc310_3285181658"/>
+      <w:bookmarkEnd w:id="78"/>
       <w:r>
         <w:rPr/>
         <w:t>NEWLINE – Move cursor down 1 line</w:t>
@@ -35233,15 +35101,15 @@
         <w:pStyle w:val="Heading4"/>
         <w:numPr>
           <w:ilvl w:val="3"/>
-          <w:numId w:val="1"/>
+          <w:numId w:val="2"/>
         </w:numPr>
         <w:bidi w:val="0"/>
         <w:ind w:hanging="0" w:start="0"/>
         <w:jc w:val="start"/>
         <w:rPr/>
       </w:pPr>
-      <w:bookmarkStart w:id="82" w:name="__RefHeading___Toc312_3285181658"/>
-      <w:bookmarkEnd w:id="82"/>
+      <w:bookmarkStart w:id="79" w:name="__RefHeading___Toc312_3285181658"/>
+      <w:bookmarkEnd w:id="79"/>
       <w:r>
         <w:rPr/>
         <w:t>VGA_COLOR_BLACK</w:t>
@@ -35284,15 +35152,15 @@
         <w:pStyle w:val="Heading4"/>
         <w:numPr>
           <w:ilvl w:val="3"/>
-          <w:numId w:val="1"/>
+          <w:numId w:val="2"/>
         </w:numPr>
         <w:bidi w:val="0"/>
         <w:ind w:hanging="0" w:start="0"/>
         <w:jc w:val="start"/>
         <w:rPr/>
       </w:pPr>
-      <w:bookmarkStart w:id="83" w:name="__RefHeading___Toc314_3285181658"/>
-      <w:bookmarkEnd w:id="83"/>
+      <w:bookmarkStart w:id="80" w:name="__RefHeading___Toc314_3285181658"/>
+      <w:bookmarkEnd w:id="80"/>
       <w:r>
         <w:rPr/>
         <w:t>VGA_COLOR_BLUE</w:t>
@@ -35335,15 +35203,15 @@
         <w:pStyle w:val="Heading4"/>
         <w:numPr>
           <w:ilvl w:val="3"/>
-          <w:numId w:val="1"/>
+          <w:numId w:val="2"/>
         </w:numPr>
         <w:bidi w:val="0"/>
         <w:ind w:hanging="0" w:start="0"/>
         <w:jc w:val="start"/>
         <w:rPr/>
       </w:pPr>
-      <w:bookmarkStart w:id="84" w:name="__RefHeading___Toc316_3285181658"/>
-      <w:bookmarkEnd w:id="84"/>
+      <w:bookmarkStart w:id="81" w:name="__RefHeading___Toc316_3285181658"/>
+      <w:bookmarkEnd w:id="81"/>
       <w:r>
         <w:rPr/>
         <w:t>VGA_COLOR_BROWN</w:t>
@@ -35386,15 +35254,15 @@
         <w:pStyle w:val="Heading4"/>
         <w:numPr>
           <w:ilvl w:val="3"/>
-          <w:numId w:val="1"/>
+          <w:numId w:val="2"/>
         </w:numPr>
         <w:bidi w:val="0"/>
         <w:ind w:hanging="0" w:start="0"/>
         <w:jc w:val="start"/>
         <w:rPr/>
       </w:pPr>
-      <w:bookmarkStart w:id="85" w:name="__RefHeading___Toc318_3285181658"/>
-      <w:bookmarkEnd w:id="85"/>
+      <w:bookmarkStart w:id="82" w:name="__RefHeading___Toc318_3285181658"/>
+      <w:bookmarkEnd w:id="82"/>
       <w:r>
         <w:rPr/>
         <w:t>VGA_COLOR_CYAN</w:t>
@@ -35437,15 +35305,15 @@
         <w:pStyle w:val="Heading4"/>
         <w:numPr>
           <w:ilvl w:val="3"/>
-          <w:numId w:val="1"/>
+          <w:numId w:val="2"/>
         </w:numPr>
         <w:bidi w:val="0"/>
         <w:ind w:hanging="0" w:start="0"/>
         <w:jc w:val="start"/>
         <w:rPr/>
       </w:pPr>
-      <w:bookmarkStart w:id="86" w:name="__RefHeading___Toc320_3285181658"/>
-      <w:bookmarkEnd w:id="86"/>
+      <w:bookmarkStart w:id="83" w:name="__RefHeading___Toc320_3285181658"/>
+      <w:bookmarkEnd w:id="83"/>
       <w:r>
         <w:rPr/>
         <w:t>VGA_COLOR_DARK_GREY</w:t>
@@ -35488,15 +35356,15 @@
         <w:pStyle w:val="Heading4"/>
         <w:numPr>
           <w:ilvl w:val="3"/>
-          <w:numId w:val="1"/>
+          <w:numId w:val="2"/>
         </w:numPr>
         <w:bidi w:val="0"/>
         <w:ind w:hanging="0" w:start="0"/>
         <w:jc w:val="start"/>
         <w:rPr/>
       </w:pPr>
-      <w:bookmarkStart w:id="87" w:name="__RefHeading___Toc322_3285181658"/>
-      <w:bookmarkEnd w:id="87"/>
+      <w:bookmarkStart w:id="84" w:name="__RefHeading___Toc322_3285181658"/>
+      <w:bookmarkEnd w:id="84"/>
       <w:r>
         <w:rPr/>
         <w:t>VGA_COLOR_END</w:t>
@@ -35541,15 +35409,15 @@
         <w:pStyle w:val="Heading4"/>
         <w:numPr>
           <w:ilvl w:val="3"/>
-          <w:numId w:val="1"/>
+          <w:numId w:val="2"/>
         </w:numPr>
         <w:bidi w:val="0"/>
         <w:ind w:hanging="0" w:start="0"/>
         <w:jc w:val="start"/>
         <w:rPr/>
       </w:pPr>
-      <w:bookmarkStart w:id="88" w:name="__RefHeading___Toc324_3285181658"/>
-      <w:bookmarkEnd w:id="88"/>
+      <w:bookmarkStart w:id="85" w:name="__RefHeading___Toc324_3285181658"/>
+      <w:bookmarkEnd w:id="85"/>
       <w:r>
         <w:rPr/>
         <w:t>VGA_COLOR_GREEN</w:t>
@@ -35592,15 +35460,15 @@
         <w:pStyle w:val="Heading4"/>
         <w:numPr>
           <w:ilvl w:val="3"/>
-          <w:numId w:val="1"/>
+          <w:numId w:val="2"/>
         </w:numPr>
         <w:bidi w:val="0"/>
         <w:ind w:hanging="0" w:start="0"/>
         <w:jc w:val="start"/>
         <w:rPr/>
       </w:pPr>
-      <w:bookmarkStart w:id="89" w:name="__RefHeading___Toc326_3285181658"/>
-      <w:bookmarkEnd w:id="89"/>
+      <w:bookmarkStart w:id="86" w:name="__RefHeading___Toc326_3285181658"/>
+      <w:bookmarkEnd w:id="86"/>
       <w:r>
         <w:rPr/>
         <w:t>VGA_COLOR_MAGENTA</w:t>
@@ -35643,15 +35511,15 @@
         <w:pStyle w:val="Heading4"/>
         <w:numPr>
           <w:ilvl w:val="3"/>
-          <w:numId w:val="1"/>
+          <w:numId w:val="2"/>
         </w:numPr>
         <w:bidi w:val="0"/>
         <w:ind w:hanging="0" w:start="0"/>
         <w:jc w:val="start"/>
         <w:rPr/>
       </w:pPr>
-      <w:bookmarkStart w:id="90" w:name="__RefHeading___Toc328_3285181658"/>
-      <w:bookmarkEnd w:id="90"/>
+      <w:bookmarkStart w:id="87" w:name="__RefHeading___Toc328_3285181658"/>
+      <w:bookmarkEnd w:id="87"/>
       <w:r>
         <w:rPr/>
         <w:t>VGA_COLOR_RED</w:t>
@@ -35694,15 +35562,15 @@
         <w:pStyle w:val="Heading4"/>
         <w:numPr>
           <w:ilvl w:val="3"/>
-          <w:numId w:val="1"/>
+          <w:numId w:val="2"/>
         </w:numPr>
         <w:bidi w:val="0"/>
         <w:ind w:hanging="0" w:start="0"/>
         <w:jc w:val="start"/>
         <w:rPr/>
       </w:pPr>
-      <w:bookmarkStart w:id="91" w:name="__RefHeading___Toc330_3285181658"/>
-      <w:bookmarkEnd w:id="91"/>
+      <w:bookmarkStart w:id="88" w:name="__RefHeading___Toc330_3285181658"/>
+      <w:bookmarkEnd w:id="88"/>
       <w:r>
         <w:rPr/>
         <w:t>VGA_COLOR_LIGHT_CYAN</w:t>
@@ -35745,15 +35613,15 @@
         <w:pStyle w:val="Heading4"/>
         <w:numPr>
           <w:ilvl w:val="3"/>
-          <w:numId w:val="1"/>
+          <w:numId w:val="2"/>
         </w:numPr>
         <w:bidi w:val="0"/>
         <w:ind w:hanging="0" w:start="0"/>
         <w:jc w:val="start"/>
         <w:rPr/>
       </w:pPr>
-      <w:bookmarkStart w:id="92" w:name="__RefHeading___Toc332_3285181658"/>
-      <w:bookmarkEnd w:id="92"/>
+      <w:bookmarkStart w:id="89" w:name="__RefHeading___Toc332_3285181658"/>
+      <w:bookmarkEnd w:id="89"/>
       <w:r>
         <w:rPr/>
         <w:t>VGA_COLOR_LIGHT_BLUE</w:t>
@@ -35796,15 +35664,15 @@
         <w:pStyle w:val="Heading4"/>
         <w:numPr>
           <w:ilvl w:val="3"/>
-          <w:numId w:val="1"/>
+          <w:numId w:val="2"/>
         </w:numPr>
         <w:bidi w:val="0"/>
         <w:ind w:hanging="0" w:start="0"/>
         <w:jc w:val="start"/>
         <w:rPr/>
       </w:pPr>
-      <w:bookmarkStart w:id="93" w:name="__RefHeading___Toc334_3285181658"/>
-      <w:bookmarkEnd w:id="93"/>
+      <w:bookmarkStart w:id="90" w:name="__RefHeading___Toc334_3285181658"/>
+      <w:bookmarkEnd w:id="90"/>
       <w:r>
         <w:rPr/>
         <w:t>VGA_COLOR_LIGHT_BROWN</w:t>
@@ -35847,15 +35715,15 @@
         <w:pStyle w:val="Heading4"/>
         <w:numPr>
           <w:ilvl w:val="3"/>
-          <w:numId w:val="1"/>
+          <w:numId w:val="2"/>
         </w:numPr>
         <w:bidi w:val="0"/>
         <w:ind w:hanging="0" w:start="0"/>
         <w:jc w:val="start"/>
         <w:rPr/>
       </w:pPr>
-      <w:bookmarkStart w:id="94" w:name="__RefHeading___Toc336_3285181658"/>
-      <w:bookmarkEnd w:id="94"/>
+      <w:bookmarkStart w:id="91" w:name="__RefHeading___Toc336_3285181658"/>
+      <w:bookmarkEnd w:id="91"/>
       <w:r>
         <w:rPr/>
         <w:t>VGA_COLOR_LIGHT_GREEN</w:t>
@@ -35898,15 +35766,15 @@
         <w:pStyle w:val="Heading4"/>
         <w:numPr>
           <w:ilvl w:val="3"/>
-          <w:numId w:val="1"/>
+          <w:numId w:val="2"/>
         </w:numPr>
         <w:bidi w:val="0"/>
         <w:ind w:hanging="0" w:start="0"/>
         <w:jc w:val="start"/>
         <w:rPr/>
       </w:pPr>
-      <w:bookmarkStart w:id="95" w:name="__RefHeading___Toc338_3285181658"/>
-      <w:bookmarkEnd w:id="95"/>
+      <w:bookmarkStart w:id="92" w:name="__RefHeading___Toc338_3285181658"/>
+      <w:bookmarkEnd w:id="92"/>
       <w:r>
         <w:rPr/>
         <w:t>VGA_COLOR_LIGHT_GREY</w:t>
@@ -35949,15 +35817,15 @@
         <w:pStyle w:val="Heading4"/>
         <w:numPr>
           <w:ilvl w:val="3"/>
-          <w:numId w:val="1"/>
+          <w:numId w:val="2"/>
         </w:numPr>
         <w:bidi w:val="0"/>
         <w:ind w:hanging="0" w:start="0"/>
         <w:jc w:val="start"/>
         <w:rPr/>
       </w:pPr>
-      <w:bookmarkStart w:id="96" w:name="__RefHeading___Toc340_3285181658"/>
-      <w:bookmarkEnd w:id="96"/>
+      <w:bookmarkStart w:id="93" w:name="__RefHeading___Toc340_3285181658"/>
+      <w:bookmarkEnd w:id="93"/>
       <w:r>
         <w:rPr/>
         <w:t>VGA_COLOR_LIGHT_MAGENTA</w:t>
@@ -36000,15 +35868,15 @@
         <w:pStyle w:val="Heading4"/>
         <w:numPr>
           <w:ilvl w:val="3"/>
-          <w:numId w:val="1"/>
+          <w:numId w:val="2"/>
         </w:numPr>
         <w:bidi w:val="0"/>
         <w:ind w:hanging="0" w:start="0"/>
         <w:jc w:val="start"/>
         <w:rPr/>
       </w:pPr>
-      <w:bookmarkStart w:id="97" w:name="__RefHeading___Toc342_3285181658"/>
-      <w:bookmarkEnd w:id="97"/>
+      <w:bookmarkStart w:id="94" w:name="__RefHeading___Toc342_3285181658"/>
+      <w:bookmarkEnd w:id="94"/>
       <w:r>
         <w:rPr/>
         <w:t>VGA_COLOR_LIGHT_RED</w:t>
@@ -36051,15 +35919,15 @@
         <w:pStyle w:val="Heading4"/>
         <w:numPr>
           <w:ilvl w:val="3"/>
-          <w:numId w:val="1"/>
+          <w:numId w:val="2"/>
         </w:numPr>
         <w:bidi w:val="0"/>
         <w:ind w:hanging="0" w:start="0"/>
         <w:jc w:val="start"/>
         <w:rPr/>
       </w:pPr>
-      <w:bookmarkStart w:id="98" w:name="__RefHeading___Toc344_3285181658"/>
-      <w:bookmarkEnd w:id="98"/>
+      <w:bookmarkStart w:id="95" w:name="__RefHeading___Toc344_3285181658"/>
+      <w:bookmarkEnd w:id="95"/>
       <w:r>
         <w:rPr/>
         <w:t>VGA_COLOR_WHITE</w:t>
@@ -36102,15 +35970,15 @@
         <w:pStyle w:val="Heading4"/>
         <w:numPr>
           <w:ilvl w:val="3"/>
-          <w:numId w:val="1"/>
+          <w:numId w:val="2"/>
         </w:numPr>
         <w:bidi w:val="0"/>
         <w:ind w:hanging="0" w:start="0"/>
         <w:jc w:val="start"/>
         <w:rPr/>
       </w:pPr>
-      <w:bookmarkStart w:id="99" w:name="__RefHeading___Toc346_3285181658"/>
-      <w:bookmarkEnd w:id="99"/>
+      <w:bookmarkStart w:id="96" w:name="__RefHeading___Toc346_3285181658"/>
+      <w:bookmarkEnd w:id="96"/>
       <w:r>
         <w:rPr/>
         <w:t>VGA_HEIGHT</w:t>
@@ -36153,15 +36021,15 @@
         <w:pStyle w:val="Heading4"/>
         <w:numPr>
           <w:ilvl w:val="3"/>
-          <w:numId w:val="1"/>
+          <w:numId w:val="2"/>
         </w:numPr>
         <w:bidi w:val="0"/>
         <w:ind w:hanging="0" w:start="0"/>
         <w:jc w:val="start"/>
         <w:rPr/>
       </w:pPr>
-      <w:bookmarkStart w:id="100" w:name="__RefHeading___Toc348_3285181658"/>
-      <w:bookmarkEnd w:id="100"/>
+      <w:bookmarkStart w:id="97" w:name="__RefHeading___Toc348_3285181658"/>
+      <w:bookmarkEnd w:id="97"/>
       <w:r>
         <w:rPr/>
         <w:t>VGA_MEMORY_ADDRESS</w:t>
@@ -36204,15 +36072,15 @@
         <w:pStyle w:val="Heading4"/>
         <w:numPr>
           <w:ilvl w:val="3"/>
-          <w:numId w:val="1"/>
+          <w:numId w:val="2"/>
         </w:numPr>
         <w:bidi w:val="0"/>
         <w:ind w:hanging="0" w:start="0"/>
         <w:jc w:val="start"/>
         <w:rPr/>
       </w:pPr>
-      <w:bookmarkStart w:id="101" w:name="__RefHeading___Toc350_3285181658"/>
-      <w:bookmarkEnd w:id="101"/>
+      <w:bookmarkStart w:id="98" w:name="__RefHeading___Toc350_3285181658"/>
+      <w:bookmarkEnd w:id="98"/>
       <w:r>
         <w:rPr/>
         <w:t>VGA_WIDTH</w:t>
@@ -36255,15 +36123,15 @@
         <w:pStyle w:val="Heading3"/>
         <w:numPr>
           <w:ilvl w:val="2"/>
-          <w:numId w:val="1"/>
+          <w:numId w:val="2"/>
         </w:numPr>
         <w:bidi w:val="0"/>
         <w:ind w:hanging="0" w:start="0"/>
         <w:jc w:val="start"/>
         <w:rPr/>
       </w:pPr>
-      <w:bookmarkStart w:id="102" w:name="__RefHeading___Toc277_3285181658"/>
-      <w:bookmarkEnd w:id="102"/>
+      <w:bookmarkStart w:id="99" w:name="__RefHeading___Toc277_3285181658"/>
+      <w:bookmarkEnd w:id="99"/>
       <w:r>
         <w:rPr/>
         <w:t>enums</w:t>
@@ -36274,15 +36142,15 @@
         <w:pStyle w:val="Heading4"/>
         <w:numPr>
           <w:ilvl w:val="3"/>
-          <w:numId w:val="1"/>
+          <w:numId w:val="2"/>
         </w:numPr>
         <w:bidi w:val="0"/>
         <w:ind w:hanging="0" w:start="0"/>
         <w:jc w:val="start"/>
         <w:rPr/>
       </w:pPr>
-      <w:bookmarkStart w:id="103" w:name="__RefHeading___Toc352_3285181658"/>
-      <w:bookmarkEnd w:id="103"/>
+      <w:bookmarkStart w:id="100" w:name="__RefHeading___Toc352_3285181658"/>
+      <w:bookmarkEnd w:id="100"/>
       <w:r>
         <w:rPr/>
         <w:t>vga_color – different colors for VGA Text mode</w:t>
@@ -36546,15 +36414,15 @@
         <w:pStyle w:val="Heading3"/>
         <w:numPr>
           <w:ilvl w:val="2"/>
-          <w:numId w:val="1"/>
+          <w:numId w:val="2"/>
         </w:numPr>
         <w:bidi w:val="0"/>
         <w:ind w:hanging="0" w:start="0"/>
         <w:jc w:val="start"/>
         <w:rPr/>
       </w:pPr>
-      <w:bookmarkStart w:id="104" w:name="__RefHeading___Toc354_3285181658"/>
-      <w:bookmarkEnd w:id="104"/>
+      <w:bookmarkStart w:id="101" w:name="__RefHeading___Toc354_3285181658"/>
+      <w:bookmarkEnd w:id="101"/>
       <w:r>
         <w:rPr/>
         <w:t>Functions</w:t>
@@ -36565,15 +36433,15 @@
         <w:pStyle w:val="Heading4"/>
         <w:numPr>
           <w:ilvl w:val="3"/>
-          <w:numId w:val="1"/>
+          <w:numId w:val="2"/>
         </w:numPr>
         <w:bidi w:val="0"/>
         <w:ind w:hanging="0" w:start="0"/>
         <w:jc w:val="start"/>
         <w:rPr/>
       </w:pPr>
-      <w:bookmarkStart w:id="105" w:name="__RefHeading___Toc356_3285181658"/>
-      <w:bookmarkEnd w:id="105"/>
+      <w:bookmarkStart w:id="102" w:name="__RefHeading___Toc356_3285181658"/>
+      <w:bookmarkEnd w:id="102"/>
       <w:r>
         <w:rPr/>
         <w:t>INIT – initialize the driver</w:t>
@@ -36584,15 +36452,15 @@
         <w:pStyle w:val="Heading4"/>
         <w:numPr>
           <w:ilvl w:val="3"/>
-          <w:numId w:val="1"/>
+          <w:numId w:val="2"/>
         </w:numPr>
         <w:bidi w:val="0"/>
         <w:ind w:hanging="0" w:start="0"/>
         <w:jc w:val="start"/>
         <w:rPr/>
       </w:pPr>
-      <w:bookmarkStart w:id="106" w:name="__RefHeading___Toc279_3285181658"/>
-      <w:bookmarkEnd w:id="106"/>
+      <w:bookmarkStart w:id="103" w:name="__RefHeading___Toc279_3285181658"/>
+      <w:bookmarkEnd w:id="103"/>
       <w:r>
         <w:rPr/>
         <w:t>PUTC – put a character at the current cursor position and move the cursor</w:t>
@@ -36603,15 +36471,15 @@
         <w:pStyle w:val="Heading4"/>
         <w:numPr>
           <w:ilvl w:val="3"/>
-          <w:numId w:val="1"/>
+          <w:numId w:val="2"/>
         </w:numPr>
         <w:bidi w:val="0"/>
         <w:ind w:hanging="0" w:start="0"/>
         <w:jc w:val="start"/>
         <w:rPr/>
       </w:pPr>
-      <w:bookmarkStart w:id="107" w:name="__RefHeading___Toc281_3285181658"/>
-      <w:bookmarkEnd w:id="107"/>
+      <w:bookmarkStart w:id="104" w:name="__RefHeading___Toc281_3285181658"/>
+      <w:bookmarkEnd w:id="104"/>
       <w:r>
         <w:rPr/>
         <w:t>PUTCAT – Put a character at the specified positon</w:t>
@@ -36622,15 +36490,15 @@
         <w:pStyle w:val="Heading4"/>
         <w:numPr>
           <w:ilvl w:val="3"/>
-          <w:numId w:val="1"/>
+          <w:numId w:val="2"/>
         </w:numPr>
         <w:bidi w:val="0"/>
         <w:ind w:hanging="0" w:start="0"/>
         <w:jc w:val="start"/>
         <w:rPr/>
       </w:pPr>
-      <w:bookmarkStart w:id="108" w:name="__RefHeading___Toc283_3285181658"/>
-      <w:bookmarkEnd w:id="108"/>
+      <w:bookmarkStart w:id="105" w:name="__RefHeading___Toc283_3285181658"/>
+      <w:bookmarkEnd w:id="105"/>
       <w:r>
         <w:rPr/>
         <w:t>SCROLL – Scroll the screen one line</w:t>
@@ -36641,15 +36509,15 @@
         <w:pStyle w:val="Heading2"/>
         <w:numPr>
           <w:ilvl w:val="1"/>
-          <w:numId w:val="1"/>
+          <w:numId w:val="2"/>
         </w:numPr>
         <w:bidi w:val="0"/>
         <w:ind w:hanging="0" w:start="0"/>
         <w:jc w:val="start"/>
         <w:rPr/>
       </w:pPr>
-      <w:bookmarkStart w:id="109" w:name="__RefHeading___Toc275_3285181658_Copy_1"/>
-      <w:bookmarkEnd w:id="109"/>
+      <w:bookmarkStart w:id="106" w:name="__RefHeading___Toc275_3285181658_Copy_1"/>
+      <w:bookmarkEnd w:id="106"/>
       <w:r>
         <w:rPr/>
         <w:t>Standards</w:t>
@@ -36660,13 +36528,13 @@
         <w:pStyle w:val="Heading3"/>
         <w:numPr>
           <w:ilvl w:val="2"/>
-          <w:numId w:val="1"/>
+          <w:numId w:val="2"/>
         </w:numPr>
         <w:ind w:hanging="0" w:start="0"/>
         <w:rPr/>
       </w:pPr>
-      <w:bookmarkStart w:id="110" w:name="__RefHeading___Toc3511_3905749740"/>
-      <w:bookmarkEnd w:id="110"/>
+      <w:bookmarkStart w:id="107" w:name="__RefHeading___Toc3511_3905749740"/>
+      <w:bookmarkEnd w:id="107"/>
       <w:r>
         <w:rPr/>
         <w:t>Inline functions</w:t>
@@ -36687,13 +36555,13 @@
         <w:pStyle w:val="Heading3"/>
         <w:numPr>
           <w:ilvl w:val="2"/>
-          <w:numId w:val="1"/>
+          <w:numId w:val="2"/>
         </w:numPr>
         <w:ind w:hanging="0" w:start="0"/>
         <w:rPr/>
       </w:pPr>
-      <w:bookmarkStart w:id="111" w:name="__RefHeading___Toc3513_3905749740"/>
-      <w:bookmarkEnd w:id="111"/>
+      <w:bookmarkStart w:id="108" w:name="__RefHeading___Toc3513_3905749740"/>
+      <w:bookmarkEnd w:id="108"/>
       <w:r>
         <w:rPr/>
         <w:t>Page Directory and Page table entries</w:t>
@@ -36720,9 +36588,7 @@
       </w:r>
     </w:p>
     <w:sectPr>
-      <w:headerReference w:type="even" r:id="rId2"/>
-      <w:headerReference w:type="default" r:id="rId3"/>
-      <w:headerReference w:type="first" r:id="rId4"/>
+      <w:headerReference w:type="default" r:id="rId2"/>
       <w:type w:val="nextPage"/>
       <w:pgSz w:w="12240" w:h="15840"/>
       <w:pgMar w:left="1134" w:right="1134" w:gutter="0" w:header="1134" w:top="2015" w:footer="0" w:bottom="1134"/>
@@ -36736,20 +36602,6 @@
 </file>
 
 <file path=word/header1.xml><?xml version="1.0" encoding="utf-8"?>
-<w:hdr xmlns:o="urn:schemas-microsoft-com:office:office" xmlns:r="http://schemas.openxmlformats.org/officeDocument/2006/relationships" xmlns:v="urn:schemas-microsoft-com:vml" xmlns:w="http://schemas.openxmlformats.org/wordprocessingml/2006/main" xmlns:w10="urn:schemas-microsoft-com:office:word" xmlns:wp="http://schemas.openxmlformats.org/drawingml/2006/wordprocessingDrawing" xmlns:pic="http://schemas.openxmlformats.org/drawingml/2006/picture" xmlns:wps="http://schemas.microsoft.com/office/word/2010/wordprocessingShape" xmlns:wpg="http://schemas.microsoft.com/office/word/2010/wordprocessingGroup" xmlns:mc="http://schemas.openxmlformats.org/markup-compatibility/2006" xmlns:wp14="http://schemas.microsoft.com/office/word/2010/wordprocessingDrawing" xmlns:w14="http://schemas.microsoft.com/office/word/2010/wordml" xmlns:w15="http://schemas.microsoft.com/office/word/2012/wordml" mc:Ignorable="w14 wp14 w15">
-  <w:p>
-    <w:pPr>
-      <w:pStyle w:val="Header"/>
-      <w:rPr/>
-    </w:pPr>
-    <w:r>
-      <w:rPr/>
-    </w:r>
-  </w:p>
-</w:hdr>
-</file>
-
-<file path=word/header2.xml><?xml version="1.0" encoding="utf-8"?>
 <w:hdr xmlns:o="urn:schemas-microsoft-com:office:office" xmlns:r="http://schemas.openxmlformats.org/officeDocument/2006/relationships" xmlns:v="urn:schemas-microsoft-com:vml" xmlns:w="http://schemas.openxmlformats.org/wordprocessingml/2006/main" xmlns:w10="urn:schemas-microsoft-com:office:word" xmlns:wp="http://schemas.openxmlformats.org/drawingml/2006/wordprocessingDrawing" xmlns:pic="http://schemas.openxmlformats.org/drawingml/2006/picture" xmlns:wps="http://schemas.microsoft.com/office/word/2010/wordprocessingShape" xmlns:wpg="http://schemas.microsoft.com/office/word/2010/wordprocessingGroup" xmlns:mc="http://schemas.openxmlformats.org/markup-compatibility/2006" xmlns:wp14="http://schemas.microsoft.com/office/word/2010/wordprocessingDrawing" xmlns:w14="http://schemas.microsoft.com/office/word/2010/wordml" xmlns:w15="http://schemas.microsoft.com/office/word/2012/wordml" mc:Ignorable="w14 wp14 w15">
   <w:p>
     <w:pPr>
@@ -36770,25 +36622,7 @@
         <w:sz w:val="52"/>
         <w:szCs w:val="52"/>
       </w:rPr>
-      <w:t>Kernel Documenation</w:t>
-    </w:r>
-  </w:p>
-</w:hdr>
-</file>
-
-<file path=word/header3.xml><?xml version="1.0" encoding="utf-8"?>
-<w:hdr xmlns:o="urn:schemas-microsoft-com:office:office" xmlns:r="http://schemas.openxmlformats.org/officeDocument/2006/relationships" xmlns:v="urn:schemas-microsoft-com:vml" xmlns:w="http://schemas.openxmlformats.org/wordprocessingml/2006/main" xmlns:w10="urn:schemas-microsoft-com:office:word" xmlns:wp="http://schemas.openxmlformats.org/drawingml/2006/wordprocessingDrawing" xmlns:pic="http://schemas.openxmlformats.org/drawingml/2006/picture" xmlns:wps="http://schemas.microsoft.com/office/word/2010/wordprocessingShape" xmlns:wpg="http://schemas.microsoft.com/office/word/2010/wordprocessingGroup" xmlns:mc="http://schemas.openxmlformats.org/markup-compatibility/2006" xmlns:wp14="http://schemas.microsoft.com/office/word/2010/wordprocessingDrawing" xmlns:w14="http://schemas.microsoft.com/office/word/2010/wordml" xmlns:w15="http://schemas.microsoft.com/office/word/2012/wordml" mc:Ignorable="w14 wp14 w15">
-  <w:p>
-    <w:pPr>
-      <w:pStyle w:val="Header"/>
-      <w:suppressLineNumbers/>
-      <w:bidi w:val="0"/>
-      <w:jc w:val="start"/>
-      <w:rPr/>
-    </w:pPr>
-    <w:r>
-      <w:rPr/>
-      <w:tab/>
+      <w:t xml:space="preserve">Kernel Documenation </w:t>
     </w:r>
     <w:r>
       <w:rPr>
@@ -36797,7 +36631,7 @@
         <w:sz w:val="52"/>
         <w:szCs w:val="52"/>
       </w:rPr>
-      <w:t>Kernel Documenation</w:t>
+      <w:t>(out of date)</w:t>
     </w:r>
   </w:p>
 </w:hdr>
@@ -36810,7 +36644,7 @@
       <w:start w:val="1"/>
       <w:numFmt w:val="none"/>
       <w:suff w:val="nothing"/>
-      <w:lvlText w:val=""/>
+      <w:lvlText w:val="%1"/>
       <w:lvlJc w:val="start"/>
       <w:pPr>
         <w:tabs>
@@ -36818,13 +36652,12 @@
         </w:tabs>
         <w:ind w:start="0" w:hanging="0"/>
       </w:pPr>
-      <w:rPr/>
     </w:lvl>
     <w:lvl w:ilvl="1">
       <w:start w:val="1"/>
       <w:numFmt w:val="none"/>
       <w:suff w:val="nothing"/>
-      <w:lvlText w:val=""/>
+      <w:lvlText w:val="%2"/>
       <w:lvlJc w:val="start"/>
       <w:pPr>
         <w:tabs>
@@ -36832,13 +36665,12 @@
         </w:tabs>
         <w:ind w:start="0" w:hanging="0"/>
       </w:pPr>
-      <w:rPr/>
     </w:lvl>
     <w:lvl w:ilvl="2">
       <w:start w:val="1"/>
       <w:numFmt w:val="none"/>
       <w:suff w:val="nothing"/>
-      <w:lvlText w:val=""/>
+      <w:lvlText w:val="%3"/>
       <w:lvlJc w:val="start"/>
       <w:pPr>
         <w:tabs>
@@ -36846,13 +36678,12 @@
         </w:tabs>
         <w:ind w:start="0" w:hanging="0"/>
       </w:pPr>
-      <w:rPr/>
     </w:lvl>
     <w:lvl w:ilvl="3">
       <w:start w:val="1"/>
       <w:numFmt w:val="none"/>
       <w:suff w:val="nothing"/>
-      <w:lvlText w:val=""/>
+      <w:lvlText w:val="%4"/>
       <w:lvlJc w:val="start"/>
       <w:pPr>
         <w:tabs>
@@ -36860,13 +36691,12 @@
         </w:tabs>
         <w:ind w:start="0" w:hanging="0"/>
       </w:pPr>
-      <w:rPr/>
     </w:lvl>
     <w:lvl w:ilvl="4">
       <w:start w:val="1"/>
       <w:numFmt w:val="none"/>
       <w:suff w:val="nothing"/>
-      <w:lvlText w:val=""/>
+      <w:lvlText w:val="%5"/>
       <w:lvlJc w:val="start"/>
       <w:pPr>
         <w:tabs>
@@ -36874,13 +36704,12 @@
         </w:tabs>
         <w:ind w:start="0" w:hanging="0"/>
       </w:pPr>
-      <w:rPr/>
     </w:lvl>
     <w:lvl w:ilvl="5">
       <w:start w:val="1"/>
       <w:numFmt w:val="none"/>
       <w:suff w:val="nothing"/>
-      <w:lvlText w:val=""/>
+      <w:lvlText w:val="%6"/>
       <w:lvlJc w:val="start"/>
       <w:pPr>
         <w:tabs>
@@ -36888,13 +36717,12 @@
         </w:tabs>
         <w:ind w:start="0" w:hanging="0"/>
       </w:pPr>
-      <w:rPr/>
     </w:lvl>
     <w:lvl w:ilvl="6">
       <w:start w:val="1"/>
       <w:numFmt w:val="none"/>
       <w:suff w:val="nothing"/>
-      <w:lvlText w:val=""/>
+      <w:lvlText w:val="%7"/>
       <w:lvlJc w:val="start"/>
       <w:pPr>
         <w:tabs>
@@ -36902,13 +36730,12 @@
         </w:tabs>
         <w:ind w:start="0" w:hanging="0"/>
       </w:pPr>
-      <w:rPr/>
     </w:lvl>
     <w:lvl w:ilvl="7">
       <w:start w:val="1"/>
       <w:numFmt w:val="none"/>
       <w:suff w:val="nothing"/>
-      <w:lvlText w:val=""/>
+      <w:lvlText w:val="%8"/>
       <w:lvlJc w:val="start"/>
       <w:pPr>
         <w:tabs>
@@ -36916,13 +36743,12 @@
         </w:tabs>
         <w:ind w:start="0" w:hanging="0"/>
       </w:pPr>
-      <w:rPr/>
     </w:lvl>
     <w:lvl w:ilvl="8">
       <w:start w:val="1"/>
       <w:numFmt w:val="none"/>
       <w:suff w:val="nothing"/>
-      <w:lvlText w:val=""/>
+      <w:lvlText w:val="%9"/>
       <w:lvlJc w:val="start"/>
       <w:pPr>
         <w:tabs>
@@ -36930,7 +36756,6 @@
         </w:tabs>
         <w:ind w:start="0" w:hanging="0"/>
       </w:pPr>
-      <w:rPr/>
     </w:lvl>
   </w:abstractNum>
   <w:abstractNum w:abstractNumId="2">
@@ -36938,7 +36763,7 @@
       <w:start w:val="1"/>
       <w:numFmt w:val="none"/>
       <w:suff w:val="nothing"/>
-      <w:lvlText w:val=""/>
+      <w:lvlText w:val="%1"/>
       <w:lvlJc w:val="start"/>
       <w:pPr>
         <w:tabs>
@@ -36952,7 +36777,7 @@
       <w:start w:val="1"/>
       <w:numFmt w:val="none"/>
       <w:suff w:val="nothing"/>
-      <w:lvlText w:val=""/>
+      <w:lvlText w:val="%2"/>
       <w:lvlJc w:val="start"/>
       <w:pPr>
         <w:tabs>
@@ -36966,7 +36791,7 @@
       <w:start w:val="1"/>
       <w:numFmt w:val="none"/>
       <w:suff w:val="nothing"/>
-      <w:lvlText w:val=""/>
+      <w:lvlText w:val="%3"/>
       <w:lvlJc w:val="start"/>
       <w:pPr>
         <w:tabs>
@@ -36980,7 +36805,7 @@
       <w:start w:val="1"/>
       <w:numFmt w:val="none"/>
       <w:suff w:val="nothing"/>
-      <w:lvlText w:val=""/>
+      <w:lvlText w:val="%4"/>
       <w:lvlJc w:val="start"/>
       <w:pPr>
         <w:tabs>
@@ -36994,7 +36819,7 @@
       <w:start w:val="1"/>
       <w:numFmt w:val="none"/>
       <w:suff w:val="nothing"/>
-      <w:lvlText w:val=""/>
+      <w:lvlText w:val="%5"/>
       <w:lvlJc w:val="start"/>
       <w:pPr>
         <w:tabs>
@@ -37008,7 +36833,7 @@
       <w:start w:val="1"/>
       <w:numFmt w:val="none"/>
       <w:suff w:val="nothing"/>
-      <w:lvlText w:val=""/>
+      <w:lvlText w:val="%6"/>
       <w:lvlJc w:val="start"/>
       <w:pPr>
         <w:tabs>
@@ -37022,7 +36847,7 @@
       <w:start w:val="1"/>
       <w:numFmt w:val="none"/>
       <w:suff w:val="nothing"/>
-      <w:lvlText w:val=""/>
+      <w:lvlText w:val="%7"/>
       <w:lvlJc w:val="start"/>
       <w:pPr>
         <w:tabs>
@@ -37036,7 +36861,7 @@
       <w:start w:val="1"/>
       <w:numFmt w:val="none"/>
       <w:suff w:val="nothing"/>
-      <w:lvlText w:val=""/>
+      <w:lvlText w:val="%8"/>
       <w:lvlJc w:val="start"/>
       <w:pPr>
         <w:tabs>
@@ -37050,7 +36875,7 @@
       <w:start w:val="1"/>
       <w:numFmt w:val="none"/>
       <w:suff w:val="nothing"/>
-      <w:lvlText w:val=""/>
+      <w:lvlText w:val="%9"/>
       <w:lvlJc w:val="start"/>
       <w:pPr>
         <w:tabs>
@@ -37064,138 +36889,129 @@
   <w:abstractNum w:abstractNumId="3">
     <w:lvl w:ilvl="0">
       <w:start w:val="1"/>
-      <w:numFmt w:val="bullet"/>
-      <w:lvlText w:val=""/>
+      <w:numFmt w:val="none"/>
+      <w:suff w:val="nothing"/>
+      <w:lvlText w:val="%1"/>
       <w:lvlJc w:val="start"/>
       <w:pPr>
         <w:tabs>
-          <w:tab w:val="num" w:pos="720"/>
+          <w:tab w:val="num" w:pos="0"/>
         </w:tabs>
-        <w:ind w:start="720" w:hanging="360"/>
-      </w:pPr>
-      <w:rPr>
-        <w:rFonts w:ascii="Symbol" w:hAnsi="Symbol" w:cs="Symbol" w:hint="default"/>
-      </w:rPr>
+        <w:ind w:start="0" w:hanging="0"/>
+      </w:pPr>
+      <w:rPr/>
     </w:lvl>
     <w:lvl w:ilvl="1">
       <w:start w:val="1"/>
-      <w:numFmt w:val="bullet"/>
-      <w:lvlText w:val="◦"/>
+      <w:numFmt w:val="none"/>
+      <w:suff w:val="nothing"/>
+      <w:lvlText w:val="%2"/>
       <w:lvlJc w:val="start"/>
       <w:pPr>
         <w:tabs>
-          <w:tab w:val="num" w:pos="1080"/>
+          <w:tab w:val="num" w:pos="0"/>
         </w:tabs>
-        <w:ind w:start="1080" w:hanging="360"/>
-      </w:pPr>
-      <w:rPr>
-        <w:rFonts w:ascii="OpenSymbol" w:hAnsi="OpenSymbol" w:cs="OpenSymbol" w:hint="default"/>
-      </w:rPr>
+        <w:ind w:start="0" w:hanging="0"/>
+      </w:pPr>
+      <w:rPr/>
     </w:lvl>
     <w:lvl w:ilvl="2">
       <w:start w:val="1"/>
-      <w:numFmt w:val="bullet"/>
-      <w:lvlText w:val="▪"/>
+      <w:numFmt w:val="none"/>
+      <w:suff w:val="nothing"/>
+      <w:lvlText w:val="%3"/>
       <w:lvlJc w:val="start"/>
       <w:pPr>
         <w:tabs>
-          <w:tab w:val="num" w:pos="1440"/>
+          <w:tab w:val="num" w:pos="0"/>
         </w:tabs>
-        <w:ind w:start="1440" w:hanging="360"/>
-      </w:pPr>
-      <w:rPr>
-        <w:rFonts w:ascii="OpenSymbol" w:hAnsi="OpenSymbol" w:cs="OpenSymbol" w:hint="default"/>
-      </w:rPr>
+        <w:ind w:start="0" w:hanging="0"/>
+      </w:pPr>
+      <w:rPr/>
     </w:lvl>
     <w:lvl w:ilvl="3">
       <w:start w:val="1"/>
-      <w:numFmt w:val="bullet"/>
-      <w:lvlText w:val=""/>
+      <w:numFmt w:val="none"/>
+      <w:suff w:val="nothing"/>
+      <w:lvlText w:val="%4"/>
       <w:lvlJc w:val="start"/>
       <w:pPr>
         <w:tabs>
-          <w:tab w:val="num" w:pos="1800"/>
+          <w:tab w:val="num" w:pos="0"/>
         </w:tabs>
-        <w:ind w:start="1800" w:hanging="360"/>
-      </w:pPr>
-      <w:rPr>
-        <w:rFonts w:ascii="Symbol" w:hAnsi="Symbol" w:cs="Symbol" w:hint="default"/>
-      </w:rPr>
+        <w:ind w:start="0" w:hanging="0"/>
+      </w:pPr>
+      <w:rPr/>
     </w:lvl>
     <w:lvl w:ilvl="4">
       <w:start w:val="1"/>
-      <w:numFmt w:val="bullet"/>
-      <w:lvlText w:val="◦"/>
+      <w:numFmt w:val="none"/>
+      <w:suff w:val="nothing"/>
+      <w:lvlText w:val="%5"/>
       <w:lvlJc w:val="start"/>
       <w:pPr>
         <w:tabs>
-          <w:tab w:val="num" w:pos="2160"/>
+          <w:tab w:val="num" w:pos="0"/>
         </w:tabs>
-        <w:ind w:start="2160" w:hanging="360"/>
-      </w:pPr>
-      <w:rPr>
-        <w:rFonts w:ascii="OpenSymbol" w:hAnsi="OpenSymbol" w:cs="OpenSymbol" w:hint="default"/>
-      </w:rPr>
+        <w:ind w:start="0" w:hanging="0"/>
+      </w:pPr>
+      <w:rPr/>
     </w:lvl>
     <w:lvl w:ilvl="5">
       <w:start w:val="1"/>
-      <w:numFmt w:val="bullet"/>
-      <w:lvlText w:val="▪"/>
+      <w:numFmt w:val="none"/>
+      <w:suff w:val="nothing"/>
+      <w:lvlText w:val="%6"/>
       <w:lvlJc w:val="start"/>
       <w:pPr>
         <w:tabs>
-          <w:tab w:val="num" w:pos="2520"/>
+          <w:tab w:val="num" w:pos="0"/>
         </w:tabs>
-        <w:ind w:start="2520" w:hanging="360"/>
-      </w:pPr>
-      <w:rPr>
-        <w:rFonts w:ascii="OpenSymbol" w:hAnsi="OpenSymbol" w:cs="OpenSymbol" w:hint="default"/>
-      </w:rPr>
+        <w:ind w:start="0" w:hanging="0"/>
+      </w:pPr>
+      <w:rPr/>
     </w:lvl>
     <w:lvl w:ilvl="6">
       <w:start w:val="1"/>
-      <w:numFmt w:val="bullet"/>
-      <w:lvlText w:val=""/>
+      <w:numFmt w:val="none"/>
+      <w:suff w:val="nothing"/>
+      <w:lvlText w:val="%7"/>
       <w:lvlJc w:val="start"/>
       <w:pPr>
         <w:tabs>
-          <w:tab w:val="num" w:pos="2880"/>
+          <w:tab w:val="num" w:pos="0"/>
         </w:tabs>
-        <w:ind w:start="2880" w:hanging="360"/>
-      </w:pPr>
-      <w:rPr>
-        <w:rFonts w:ascii="Symbol" w:hAnsi="Symbol" w:cs="Symbol" w:hint="default"/>
-      </w:rPr>
+        <w:ind w:start="0" w:hanging="0"/>
+      </w:pPr>
+      <w:rPr/>
     </w:lvl>
     <w:lvl w:ilvl="7">
       <w:start w:val="1"/>
-      <w:numFmt w:val="bullet"/>
-      <w:lvlText w:val="◦"/>
+      <w:numFmt w:val="none"/>
+      <w:suff w:val="nothing"/>
+      <w:lvlText w:val="%8"/>
       <w:lvlJc w:val="start"/>
       <w:pPr>
         <w:tabs>
-          <w:tab w:val="num" w:pos="3240"/>
+          <w:tab w:val="num" w:pos="0"/>
         </w:tabs>
-        <w:ind w:start="3240" w:hanging="360"/>
-      </w:pPr>
-      <w:rPr>
-        <w:rFonts w:ascii="OpenSymbol" w:hAnsi="OpenSymbol" w:cs="OpenSymbol" w:hint="default"/>
-      </w:rPr>
+        <w:ind w:start="0" w:hanging="0"/>
+      </w:pPr>
+      <w:rPr/>
     </w:lvl>
     <w:lvl w:ilvl="8">
       <w:start w:val="1"/>
-      <w:numFmt w:val="bullet"/>
-      <w:lvlText w:val="▪"/>
+      <w:numFmt w:val="none"/>
+      <w:suff w:val="nothing"/>
+      <w:lvlText w:val="%9"/>
       <w:lvlJc w:val="start"/>
       <w:pPr>
         <w:tabs>
-          <w:tab w:val="num" w:pos="3600"/>
+          <w:tab w:val="num" w:pos="0"/>
         </w:tabs>
-        <w:ind w:start="3600" w:hanging="360"/>
-      </w:pPr>
-      <w:rPr>
-        <w:rFonts w:ascii="OpenSymbol" w:hAnsi="OpenSymbol" w:cs="OpenSymbol" w:hint="default"/>
-      </w:rPr>
+        <w:ind w:start="0" w:hanging="0"/>
+      </w:pPr>
+      <w:rPr/>
     </w:lvl>
   </w:abstractNum>
   <w:abstractNum w:abstractNumId="4">
@@ -37886,120 +37702,138 @@
   <w:abstractNum w:abstractNumId="9">
     <w:lvl w:ilvl="0">
       <w:start w:val="1"/>
-      <w:numFmt w:val="none"/>
-      <w:suff w:val="nothing"/>
-      <w:lvlText w:val=""/>
+      <w:numFmt w:val="bullet"/>
+      <w:lvlText w:val=""/>
       <w:lvlJc w:val="start"/>
       <w:pPr>
         <w:tabs>
-          <w:tab w:val="num" w:pos="0"/>
+          <w:tab w:val="num" w:pos="720"/>
         </w:tabs>
-        <w:ind w:start="0" w:hanging="0"/>
-      </w:pPr>
+        <w:ind w:start="720" w:hanging="360"/>
+      </w:pPr>
+      <w:rPr>
+        <w:rFonts w:ascii="Symbol" w:hAnsi="Symbol" w:cs="Symbol" w:hint="default"/>
+      </w:rPr>
     </w:lvl>
     <w:lvl w:ilvl="1">
       <w:start w:val="1"/>
-      <w:numFmt w:val="none"/>
-      <w:suff w:val="nothing"/>
-      <w:lvlText w:val=""/>
+      <w:numFmt w:val="bullet"/>
+      <w:lvlText w:val="◦"/>
       <w:lvlJc w:val="start"/>
       <w:pPr>
         <w:tabs>
-          <w:tab w:val="num" w:pos="0"/>
+          <w:tab w:val="num" w:pos="1080"/>
         </w:tabs>
-        <w:ind w:start="0" w:hanging="0"/>
-      </w:pPr>
+        <w:ind w:start="1080" w:hanging="360"/>
+      </w:pPr>
+      <w:rPr>
+        <w:rFonts w:ascii="OpenSymbol" w:hAnsi="OpenSymbol" w:cs="OpenSymbol" w:hint="default"/>
+      </w:rPr>
     </w:lvl>
     <w:lvl w:ilvl="2">
       <w:start w:val="1"/>
-      <w:numFmt w:val="none"/>
-      <w:suff w:val="nothing"/>
-      <w:lvlText w:val=""/>
+      <w:numFmt w:val="bullet"/>
+      <w:lvlText w:val="▪"/>
       <w:lvlJc w:val="start"/>
       <w:pPr>
         <w:tabs>
-          <w:tab w:val="num" w:pos="0"/>
+          <w:tab w:val="num" w:pos="1440"/>
         </w:tabs>
-        <w:ind w:start="0" w:hanging="0"/>
-      </w:pPr>
+        <w:ind w:start="1440" w:hanging="360"/>
+      </w:pPr>
+      <w:rPr>
+        <w:rFonts w:ascii="OpenSymbol" w:hAnsi="OpenSymbol" w:cs="OpenSymbol" w:hint="default"/>
+      </w:rPr>
     </w:lvl>
     <w:lvl w:ilvl="3">
       <w:start w:val="1"/>
-      <w:numFmt w:val="none"/>
-      <w:suff w:val="nothing"/>
-      <w:lvlText w:val=""/>
+      <w:numFmt w:val="bullet"/>
+      <w:lvlText w:val=""/>
       <w:lvlJc w:val="start"/>
       <w:pPr>
         <w:tabs>
-          <w:tab w:val="num" w:pos="0"/>
+          <w:tab w:val="num" w:pos="1800"/>
         </w:tabs>
-        <w:ind w:start="0" w:hanging="0"/>
-      </w:pPr>
+        <w:ind w:start="1800" w:hanging="360"/>
+      </w:pPr>
+      <w:rPr>
+        <w:rFonts w:ascii="Symbol" w:hAnsi="Symbol" w:cs="Symbol" w:hint="default"/>
+      </w:rPr>
     </w:lvl>
     <w:lvl w:ilvl="4">
       <w:start w:val="1"/>
-      <w:numFmt w:val="none"/>
-      <w:suff w:val="nothing"/>
-      <w:lvlText w:val=""/>
+      <w:numFmt w:val="bullet"/>
+      <w:lvlText w:val="◦"/>
       <w:lvlJc w:val="start"/>
       <w:pPr>
         <w:tabs>
-          <w:tab w:val="num" w:pos="0"/>
+          <w:tab w:val="num" w:pos="2160"/>
         </w:tabs>
-        <w:ind w:start="0" w:hanging="0"/>
-      </w:pPr>
+        <w:ind w:start="2160" w:hanging="360"/>
+      </w:pPr>
+      <w:rPr>
+        <w:rFonts w:ascii="OpenSymbol" w:hAnsi="OpenSymbol" w:cs="OpenSymbol" w:hint="default"/>
+      </w:rPr>
     </w:lvl>
     <w:lvl w:ilvl="5">
       <w:start w:val="1"/>
-      <w:numFmt w:val="none"/>
-      <w:suff w:val="nothing"/>
-      <w:lvlText w:val=""/>
+      <w:numFmt w:val="bullet"/>
+      <w:lvlText w:val="▪"/>
       <w:lvlJc w:val="start"/>
       <w:pPr>
         <w:tabs>
-          <w:tab w:val="num" w:pos="0"/>
+          <w:tab w:val="num" w:pos="2520"/>
         </w:tabs>
-        <w:ind w:start="0" w:hanging="0"/>
-      </w:pPr>
+        <w:ind w:start="2520" w:hanging="360"/>
+      </w:pPr>
+      <w:rPr>
+        <w:rFonts w:ascii="OpenSymbol" w:hAnsi="OpenSymbol" w:cs="OpenSymbol" w:hint="default"/>
+      </w:rPr>
     </w:lvl>
     <w:lvl w:ilvl="6">
       <w:start w:val="1"/>
-      <w:numFmt w:val="none"/>
-      <w:suff w:val="nothing"/>
-      <w:lvlText w:val=""/>
+      <w:numFmt w:val="bullet"/>
+      <w:lvlText w:val=""/>
       <w:lvlJc w:val="start"/>
       <w:pPr>
         <w:tabs>
-          <w:tab w:val="num" w:pos="0"/>
+          <w:tab w:val="num" w:pos="2880"/>
         </w:tabs>
-        <w:ind w:start="0" w:hanging="0"/>
-      </w:pPr>
+        <w:ind w:start="2880" w:hanging="360"/>
+      </w:pPr>
+      <w:rPr>
+        <w:rFonts w:ascii="Symbol" w:hAnsi="Symbol" w:cs="Symbol" w:hint="default"/>
+      </w:rPr>
     </w:lvl>
     <w:lvl w:ilvl="7">
       <w:start w:val="1"/>
-      <w:numFmt w:val="none"/>
-      <w:suff w:val="nothing"/>
-      <w:lvlText w:val=""/>
+      <w:numFmt w:val="bullet"/>
+      <w:lvlText w:val="◦"/>
       <w:lvlJc w:val="start"/>
       <w:pPr>
         <w:tabs>
-          <w:tab w:val="num" w:pos="0"/>
+          <w:tab w:val="num" w:pos="3240"/>
         </w:tabs>
-        <w:ind w:start="0" w:hanging="0"/>
-      </w:pPr>
+        <w:ind w:start="3240" w:hanging="360"/>
+      </w:pPr>
+      <w:rPr>
+        <w:rFonts w:ascii="OpenSymbol" w:hAnsi="OpenSymbol" w:cs="OpenSymbol" w:hint="default"/>
+      </w:rPr>
     </w:lvl>
     <w:lvl w:ilvl="8">
       <w:start w:val="1"/>
-      <w:numFmt w:val="none"/>
-      <w:suff w:val="nothing"/>
-      <w:lvlText w:val=""/>
+      <w:numFmt w:val="bullet"/>
+      <w:lvlText w:val="▪"/>
       <w:lvlJc w:val="start"/>
       <w:pPr>
         <w:tabs>
-          <w:tab w:val="num" w:pos="0"/>
+          <w:tab w:val="num" w:pos="3600"/>
         </w:tabs>
-        <w:ind w:start="0" w:hanging="0"/>
-      </w:pPr>
+        <w:ind w:start="3600" w:hanging="360"/>
+      </w:pPr>
+      <w:rPr>
+        <w:rFonts w:ascii="OpenSymbol" w:hAnsi="OpenSymbol" w:cs="OpenSymbol" w:hint="default"/>
+      </w:rPr>
     </w:lvl>
   </w:abstractNum>
   <w:num w:numId="1">
@@ -38055,7 +37889,9 @@
     <w:pPr>
       <w:widowControl/>
       <w:suppressAutoHyphens w:val="true"/>
+      <w:kinsoku w:val="true"/>
       <w:overflowPunct w:val="true"/>
+      <w:autoSpaceDE w:val="true"/>
       <w:bidi w:val="0"/>
       <w:spacing w:before="0" w:after="0"/>
       <w:jc w:val="start"/>
@@ -38077,7 +37913,7 @@
     <w:pPr>
       <w:numPr>
         <w:ilvl w:val="0"/>
-        <w:numId w:val="1"/>
+        <w:numId w:val="2"/>
       </w:numPr>
       <w:spacing w:before="240" w:after="120"/>
       <w:outlineLvl w:val="0"/>
@@ -38097,7 +37933,7 @@
     <w:pPr>
       <w:numPr>
         <w:ilvl w:val="1"/>
-        <w:numId w:val="1"/>
+        <w:numId w:val="2"/>
       </w:numPr>
       <w:spacing w:before="200" w:after="120"/>
       <w:outlineLvl w:val="1"/>
@@ -38117,7 +37953,7 @@
     <w:pPr>
       <w:numPr>
         <w:ilvl w:val="2"/>
-        <w:numId w:val="1"/>
+        <w:numId w:val="2"/>
       </w:numPr>
       <w:spacing w:before="140" w:after="120"/>
       <w:outlineLvl w:val="2"/>
@@ -38137,7 +37973,7 @@
     <w:pPr>
       <w:numPr>
         <w:ilvl w:val="3"/>
-        <w:numId w:val="1"/>
+        <w:numId w:val="2"/>
       </w:numPr>
       <w:spacing w:before="120" w:after="120"/>
       <w:outlineLvl w:val="3"/>
@@ -38159,7 +37995,7 @@
     <w:pPr>
       <w:numPr>
         <w:ilvl w:val="4"/>
-        <w:numId w:val="1"/>
+        <w:numId w:val="2"/>
       </w:numPr>
       <w:spacing w:before="120" w:after="60"/>
       <w:outlineLvl w:val="4"/>
@@ -38179,7 +38015,7 @@
     <w:pPr>
       <w:numPr>
         <w:ilvl w:val="5"/>
-        <w:numId w:val="1"/>
+        <w:numId w:val="2"/>
       </w:numPr>
       <w:spacing w:before="60" w:after="60"/>
       <w:outlineLvl w:val="5"/>
@@ -38201,7 +38037,7 @@
     <w:pPr>
       <w:numPr>
         <w:ilvl w:val="6"/>
-        <w:numId w:val="1"/>
+        <w:numId w:val="2"/>
       </w:numPr>
       <w:spacing w:before="60" w:after="60"/>
       <w:outlineLvl w:val="6"/>
@@ -38221,7 +38057,7 @@
     <w:pPr>
       <w:numPr>
         <w:ilvl w:val="7"/>
-        <w:numId w:val="1"/>
+        <w:numId w:val="2"/>
       </w:numPr>
       <w:spacing w:before="60" w:after="60"/>
       <w:outlineLvl w:val="7"/>
@@ -38243,7 +38079,7 @@
     <w:pPr>
       <w:numPr>
         <w:ilvl w:val="8"/>
-        <w:numId w:val="1"/>
+        <w:numId w:val="2"/>
       </w:numPr>
       <w:spacing w:before="60" w:after="60"/>
       <w:outlineLvl w:val="8"/>
@@ -38453,7 +38289,7 @@
     <w:pPr>
       <w:numPr>
         <w:ilvl w:val="0"/>
-        <w:numId w:val="2"/>
+        <w:numId w:val="3"/>
       </w:numPr>
       <w:spacing w:before="60" w:after="60"/>
     </w:pPr>

</xml_diff>